<commit_message>
Added Transaction and stuff
</commit_message>
<xml_diff>
--- a/Revision Notes.docx
+++ b/Revision Notes.docx
@@ -2138,6 +2138,589 @@
         </w:rPr>
       </w:pPr>
     </w:p>
+    <w:p>
+      <w:pPr>
+        <w:rPr>
+          <w:b/>
+          <w:bCs/>
+          <w:sz w:val="22"/>
+          <w:szCs w:val="22"/>
+        </w:rPr>
+      </w:pPr>
+      <w:r>
+        <w:rPr>
+          <w:b/>
+          <w:bCs/>
+          <w:sz w:val="22"/>
+          <w:szCs w:val="22"/>
+        </w:rPr>
+        <w:t>Created Categories Entity:</w:t>
+      </w:r>
+    </w:p>
+    <w:p>
+      <w:pPr>
+        <w:pStyle w:val="ListParagraph"/>
+        <w:numPr>
+          <w:ilvl w:val="0"/>
+          <w:numId w:val="4"/>
+        </w:numPr>
+        <w:rPr>
+          <w:b/>
+          <w:bCs/>
+          <w:sz w:val="22"/>
+          <w:szCs w:val="22"/>
+        </w:rPr>
+      </w:pPr>
+      <w:r>
+        <w:rPr>
+          <w:sz w:val="22"/>
+          <w:szCs w:val="22"/>
+        </w:rPr>
+        <w:t xml:space="preserve">Created categories entity and manually inserted 8 new categories in the table via </w:t>
+      </w:r>
+      <w:proofErr w:type="spellStart"/>
+      <w:r>
+        <w:rPr>
+          <w:sz w:val="22"/>
+          <w:szCs w:val="22"/>
+        </w:rPr>
+        <w:t>sql</w:t>
+      </w:r>
+      <w:proofErr w:type="spellEnd"/>
+      <w:r>
+        <w:rPr>
+          <w:sz w:val="22"/>
+          <w:szCs w:val="22"/>
+        </w:rPr>
+        <w:t xml:space="preserve"> via </w:t>
+      </w:r>
+      <w:proofErr w:type="spellStart"/>
+      <w:r>
+        <w:rPr>
+          <w:sz w:val="22"/>
+          <w:szCs w:val="22"/>
+        </w:rPr>
+        <w:t>pgAdmin</w:t>
+      </w:r>
+      <w:proofErr w:type="spellEnd"/>
+      <w:r>
+        <w:rPr>
+          <w:sz w:val="22"/>
+          <w:szCs w:val="22"/>
+        </w:rPr>
+        <w:t xml:space="preserve"> for getting MVP ready </w:t>
+      </w:r>
+      <w:proofErr w:type="spellStart"/>
+      <w:proofErr w:type="gramStart"/>
+      <w:r>
+        <w:rPr>
+          <w:sz w:val="22"/>
+          <w:szCs w:val="22"/>
+        </w:rPr>
+        <w:t>asap</w:t>
+      </w:r>
+      <w:proofErr w:type="spellEnd"/>
+      <w:proofErr w:type="gramEnd"/>
+      <w:r>
+        <w:rPr>
+          <w:sz w:val="22"/>
+          <w:szCs w:val="22"/>
+        </w:rPr>
+        <w:t>.</w:t>
+      </w:r>
+    </w:p>
+    <w:p>
+      <w:pPr>
+        <w:pStyle w:val="ListParagraph"/>
+        <w:numPr>
+          <w:ilvl w:val="0"/>
+          <w:numId w:val="4"/>
+        </w:numPr>
+        <w:rPr>
+          <w:b/>
+          <w:bCs/>
+          <w:sz w:val="22"/>
+          <w:szCs w:val="22"/>
+        </w:rPr>
+      </w:pPr>
+      <w:r>
+        <w:rPr>
+          <w:sz w:val="22"/>
+          <w:szCs w:val="22"/>
+        </w:rPr>
+        <w:t xml:space="preserve">Created </w:t>
+      </w:r>
+      <w:proofErr w:type="spellStart"/>
+      <w:r>
+        <w:rPr>
+          <w:sz w:val="22"/>
+          <w:szCs w:val="22"/>
+        </w:rPr>
+        <w:t>CategoryRepository</w:t>
+      </w:r>
+      <w:proofErr w:type="spellEnd"/>
+    </w:p>
+    <w:p>
+      <w:pPr>
+        <w:rPr>
+          <w:b/>
+          <w:bCs/>
+          <w:sz w:val="22"/>
+          <w:szCs w:val="22"/>
+        </w:rPr>
+      </w:pPr>
+      <w:r>
+        <w:rPr>
+          <w:b/>
+          <w:bCs/>
+          <w:sz w:val="22"/>
+          <w:szCs w:val="22"/>
+        </w:rPr>
+        <w:t>Created Transaction Entity:</w:t>
+      </w:r>
+    </w:p>
+    <w:p>
+      <w:pPr>
+        <w:pStyle w:val="ListParagraph"/>
+        <w:numPr>
+          <w:ilvl w:val="0"/>
+          <w:numId w:val="5"/>
+        </w:numPr>
+        <w:rPr>
+          <w:b/>
+          <w:bCs/>
+          <w:sz w:val="22"/>
+          <w:szCs w:val="22"/>
+        </w:rPr>
+      </w:pPr>
+      <w:r>
+        <w:rPr>
+          <w:sz w:val="22"/>
+          <w:szCs w:val="22"/>
+        </w:rPr>
+        <w:t xml:space="preserve">So far created Transaction Entity and various fields inside it – used </w:t>
+      </w:r>
+      <w:proofErr w:type="spellStart"/>
+      <w:r>
+        <w:rPr>
+          <w:sz w:val="22"/>
+          <w:szCs w:val="22"/>
+        </w:rPr>
+        <w:t>BigDecimal</w:t>
+      </w:r>
+      <w:proofErr w:type="spellEnd"/>
+      <w:r>
+        <w:rPr>
+          <w:sz w:val="22"/>
+          <w:szCs w:val="22"/>
+        </w:rPr>
+        <w:t xml:space="preserve"> as data type for amount because that’s what is used for precise financial calculation</w:t>
+      </w:r>
+    </w:p>
+    <w:p>
+      <w:pPr>
+        <w:pStyle w:val="ListParagraph"/>
+        <w:numPr>
+          <w:ilvl w:val="0"/>
+          <w:numId w:val="5"/>
+        </w:numPr>
+        <w:rPr>
+          <w:b/>
+          <w:bCs/>
+          <w:sz w:val="22"/>
+          <w:szCs w:val="22"/>
+        </w:rPr>
+      </w:pPr>
+      <w:r>
+        <w:rPr>
+          <w:sz w:val="22"/>
+          <w:szCs w:val="22"/>
+        </w:rPr>
+        <w:t xml:space="preserve">Created </w:t>
+      </w:r>
+      <w:proofErr w:type="spellStart"/>
+      <w:r>
+        <w:rPr>
+          <w:sz w:val="22"/>
+          <w:szCs w:val="22"/>
+        </w:rPr>
+        <w:t>Enum</w:t>
+      </w:r>
+      <w:proofErr w:type="spellEnd"/>
+      <w:r>
+        <w:rPr>
+          <w:sz w:val="22"/>
+          <w:szCs w:val="22"/>
+        </w:rPr>
+        <w:t xml:space="preserve"> named </w:t>
+      </w:r>
+      <w:proofErr w:type="spellStart"/>
+      <w:r>
+        <w:rPr>
+          <w:sz w:val="22"/>
+          <w:szCs w:val="22"/>
+        </w:rPr>
+        <w:t>TransactionType</w:t>
+      </w:r>
+      <w:proofErr w:type="spellEnd"/>
+      <w:r>
+        <w:rPr>
+          <w:sz w:val="22"/>
+          <w:szCs w:val="22"/>
+        </w:rPr>
+        <w:t xml:space="preserve"> to store Debit and Credit and used that </w:t>
+      </w:r>
+      <w:proofErr w:type="spellStart"/>
+      <w:r>
+        <w:rPr>
+          <w:sz w:val="22"/>
+          <w:szCs w:val="22"/>
+        </w:rPr>
+        <w:t>Enum</w:t>
+      </w:r>
+      <w:proofErr w:type="spellEnd"/>
+      <w:r>
+        <w:rPr>
+          <w:sz w:val="22"/>
+          <w:szCs w:val="22"/>
+        </w:rPr>
+        <w:t xml:space="preserve"> as data type for transaction type.</w:t>
+      </w:r>
+    </w:p>
+    <w:p>
+      <w:pPr>
+        <w:pStyle w:val="ListParagraph"/>
+        <w:numPr>
+          <w:ilvl w:val="0"/>
+          <w:numId w:val="5"/>
+        </w:numPr>
+        <w:rPr>
+          <w:b/>
+          <w:bCs/>
+          <w:sz w:val="22"/>
+          <w:szCs w:val="22"/>
+        </w:rPr>
+      </w:pPr>
+      <w:r>
+        <w:rPr>
+          <w:sz w:val="22"/>
+          <w:szCs w:val="22"/>
+        </w:rPr>
+        <w:t xml:space="preserve">Created </w:t>
+      </w:r>
+      <w:proofErr w:type="spellStart"/>
+      <w:r>
+        <w:rPr>
+          <w:sz w:val="22"/>
+          <w:szCs w:val="22"/>
+        </w:rPr>
+        <w:t>ExcelRow</w:t>
+      </w:r>
+      <w:proofErr w:type="spellEnd"/>
+      <w:r>
+        <w:rPr>
+          <w:sz w:val="22"/>
+          <w:szCs w:val="22"/>
+        </w:rPr>
+        <w:t xml:space="preserve"> DTO which has 8 fields i.e. 8 columns from ICICI bank statement</w:t>
+      </w:r>
+    </w:p>
+    <w:p>
+      <w:pPr>
+        <w:pStyle w:val="ListParagraph"/>
+        <w:numPr>
+          <w:ilvl w:val="0"/>
+          <w:numId w:val="5"/>
+        </w:numPr>
+        <w:rPr>
+          <w:b/>
+          <w:bCs/>
+          <w:sz w:val="22"/>
+          <w:szCs w:val="22"/>
+        </w:rPr>
+      </w:pPr>
+      <w:r>
+        <w:rPr>
+          <w:sz w:val="22"/>
+          <w:szCs w:val="22"/>
+        </w:rPr>
+        <w:t xml:space="preserve">Created parser package inside which DTO package has this </w:t>
+      </w:r>
+      <w:proofErr w:type="spellStart"/>
+      <w:r>
+        <w:rPr>
+          <w:sz w:val="22"/>
+          <w:szCs w:val="22"/>
+        </w:rPr>
+        <w:t>ExcelRow</w:t>
+      </w:r>
+      <w:proofErr w:type="spellEnd"/>
+      <w:r>
+        <w:rPr>
+          <w:sz w:val="22"/>
+          <w:szCs w:val="22"/>
+        </w:rPr>
+        <w:t xml:space="preserve"> DTO also </w:t>
+      </w:r>
+      <w:proofErr w:type="spellStart"/>
+      <w:r>
+        <w:rPr>
+          <w:sz w:val="22"/>
+          <w:szCs w:val="22"/>
+        </w:rPr>
+        <w:t>ExcelParserService</w:t>
+      </w:r>
+      <w:proofErr w:type="spellEnd"/>
+      <w:r>
+        <w:rPr>
+          <w:sz w:val="22"/>
+          <w:szCs w:val="22"/>
+        </w:rPr>
+        <w:t xml:space="preserve"> service is created </w:t>
+      </w:r>
+    </w:p>
+    <w:p>
+      <w:pPr>
+        <w:pStyle w:val="ListParagraph"/>
+        <w:numPr>
+          <w:ilvl w:val="0"/>
+          <w:numId w:val="5"/>
+        </w:numPr>
+        <w:rPr>
+          <w:b/>
+          <w:bCs/>
+          <w:sz w:val="22"/>
+          <w:szCs w:val="22"/>
+        </w:rPr>
+      </w:pPr>
+      <w:r>
+        <w:rPr>
+          <w:sz w:val="22"/>
+          <w:szCs w:val="22"/>
+        </w:rPr>
+        <w:t>Learnt about XSSF(XML Spreadsheet format) for .</w:t>
+      </w:r>
+      <w:proofErr w:type="spellStart"/>
+      <w:r>
+        <w:rPr>
+          <w:sz w:val="22"/>
+          <w:szCs w:val="22"/>
+        </w:rPr>
+        <w:t>xlsx</w:t>
+      </w:r>
+      <w:proofErr w:type="spellEnd"/>
+      <w:r>
+        <w:rPr>
+          <w:sz w:val="22"/>
+          <w:szCs w:val="22"/>
+        </w:rPr>
+        <w:t xml:space="preserve"> files and HSSF (Horrible Spreadsheet format) for .</w:t>
+      </w:r>
+      <w:proofErr w:type="spellStart"/>
+      <w:r>
+        <w:rPr>
+          <w:sz w:val="22"/>
+          <w:szCs w:val="22"/>
+        </w:rPr>
+        <w:t>xls</w:t>
+      </w:r>
+      <w:proofErr w:type="spellEnd"/>
+      <w:r>
+        <w:rPr>
+          <w:sz w:val="22"/>
+          <w:szCs w:val="22"/>
+        </w:rPr>
+        <w:t xml:space="preserve"> files which are part of </w:t>
+      </w:r>
+      <w:r>
+        <w:rPr>
+          <w:b/>
+          <w:bCs/>
+          <w:sz w:val="22"/>
+          <w:szCs w:val="22"/>
+        </w:rPr>
+        <w:t>Apach</w:t>
+      </w:r>
+      <w:r>
+        <w:rPr>
+          <w:b/>
+          <w:bCs/>
+          <w:sz w:val="22"/>
+          <w:szCs w:val="22"/>
+        </w:rPr>
+        <w:t>e</w:t>
+      </w:r>
+      <w:r>
+        <w:rPr>
+          <w:b/>
+          <w:bCs/>
+          <w:sz w:val="22"/>
+          <w:szCs w:val="22"/>
+        </w:rPr>
+        <w:t xml:space="preserve"> POI</w:t>
+      </w:r>
+      <w:r>
+        <w:rPr>
+          <w:b/>
+          <w:bCs/>
+          <w:sz w:val="22"/>
+          <w:szCs w:val="22"/>
+        </w:rPr>
+        <w:t xml:space="preserve"> </w:t>
+      </w:r>
+      <w:r>
+        <w:rPr>
+          <w:sz w:val="22"/>
+          <w:szCs w:val="22"/>
+        </w:rPr>
+        <w:t xml:space="preserve">project which was developed in order to work with Microsoft Office file formats such as excel, word, </w:t>
+      </w:r>
+      <w:proofErr w:type="spellStart"/>
+      <w:r>
+        <w:rPr>
+          <w:sz w:val="22"/>
+          <w:szCs w:val="22"/>
+        </w:rPr>
+        <w:t>ppt</w:t>
+      </w:r>
+      <w:proofErr w:type="spellEnd"/>
+      <w:r>
+        <w:rPr>
+          <w:sz w:val="22"/>
+          <w:szCs w:val="22"/>
+        </w:rPr>
+        <w:t>, etc</w:t>
+      </w:r>
+    </w:p>
+    <w:p>
+      <w:pPr>
+        <w:pStyle w:val="ListParagraph"/>
+        <w:numPr>
+          <w:ilvl w:val="0"/>
+          <w:numId w:val="5"/>
+        </w:numPr>
+        <w:rPr>
+          <w:b/>
+          <w:bCs/>
+          <w:sz w:val="22"/>
+          <w:szCs w:val="22"/>
+        </w:rPr>
+      </w:pPr>
+      <w:r>
+        <w:rPr>
+          <w:sz w:val="22"/>
+          <w:szCs w:val="22"/>
+        </w:rPr>
+        <w:t xml:space="preserve">Create transaction package inside which transaction entity, controller, service and </w:t>
+      </w:r>
+      <w:proofErr w:type="spellStart"/>
+      <w:r>
+        <w:rPr>
+          <w:sz w:val="22"/>
+          <w:szCs w:val="22"/>
+        </w:rPr>
+        <w:t>enum</w:t>
+      </w:r>
+      <w:proofErr w:type="spellEnd"/>
+      <w:r>
+        <w:rPr>
+          <w:sz w:val="22"/>
+          <w:szCs w:val="22"/>
+        </w:rPr>
+        <w:t xml:space="preserve"> is created.</w:t>
+      </w:r>
+    </w:p>
+    <w:p>
+      <w:pPr>
+        <w:pStyle w:val="ListParagraph"/>
+        <w:numPr>
+          <w:ilvl w:val="0"/>
+          <w:numId w:val="5"/>
+        </w:numPr>
+        <w:rPr>
+          <w:b/>
+          <w:bCs/>
+          <w:sz w:val="22"/>
+          <w:szCs w:val="22"/>
+        </w:rPr>
+      </w:pPr>
+      <w:proofErr w:type="spellStart"/>
+      <w:r>
+        <w:rPr>
+          <w:sz w:val="22"/>
+          <w:szCs w:val="22"/>
+        </w:rPr>
+        <w:t>Enum</w:t>
+      </w:r>
+      <w:proofErr w:type="spellEnd"/>
+      <w:r>
+        <w:rPr>
+          <w:sz w:val="22"/>
+          <w:szCs w:val="22"/>
+        </w:rPr>
+        <w:t xml:space="preserve"> is created for transaction type i.e. debit and credit.</w:t>
+      </w:r>
+    </w:p>
+    <w:p>
+      <w:pPr>
+        <w:pStyle w:val="ListParagraph"/>
+        <w:numPr>
+          <w:ilvl w:val="0"/>
+          <w:numId w:val="5"/>
+        </w:numPr>
+        <w:rPr>
+          <w:b/>
+          <w:bCs/>
+          <w:sz w:val="22"/>
+          <w:szCs w:val="22"/>
+        </w:rPr>
+      </w:pPr>
+      <w:r>
+        <w:rPr>
+          <w:sz w:val="22"/>
+          <w:szCs w:val="22"/>
+        </w:rPr>
+        <w:t>Added new global exception handler for parser service.</w:t>
+      </w:r>
+    </w:p>
+    <w:p>
+      <w:pPr>
+        <w:pStyle w:val="ListParagraph"/>
+        <w:numPr>
+          <w:ilvl w:val="0"/>
+          <w:numId w:val="5"/>
+        </w:numPr>
+        <w:rPr>
+          <w:b/>
+          <w:bCs/>
+          <w:sz w:val="22"/>
+          <w:szCs w:val="22"/>
+        </w:rPr>
+      </w:pPr>
+      <w:r>
+        <w:rPr>
+          <w:sz w:val="22"/>
+          <w:szCs w:val="22"/>
+        </w:rPr>
+        <w:t xml:space="preserve">But this is failing throwing exception for the excel file that we are using from </w:t>
+      </w:r>
+      <w:proofErr w:type="spellStart"/>
+      <w:r>
+        <w:rPr>
+          <w:sz w:val="22"/>
+          <w:szCs w:val="22"/>
+        </w:rPr>
+        <w:t>icici</w:t>
+      </w:r>
+      <w:proofErr w:type="spellEnd"/>
+      <w:r>
+        <w:rPr>
+          <w:sz w:val="22"/>
+          <w:szCs w:val="22"/>
+        </w:rPr>
+        <w:t xml:space="preserve"> bank so need to debug further will see tomorrow. </w:t>
+      </w:r>
+    </w:p>
     <w:sectPr>
       <w:pgSz w:w="11906" w:h="16838"/>
       <w:pgMar w:top="1440" w:right="1440" w:bottom="1440" w:left="1440" w:header="708" w:footer="708" w:gutter="0"/>
@@ -2151,6 +2734,119 @@
 <file path=word/numbering.xml><?xml version="1.0" encoding="utf-8"?>
 <w:numbering xmlns:ve="http://schemas.openxmlformats.org/markup-compatibility/2006" xmlns:o="urn:schemas-microsoft-com:office:office" xmlns:r="http://schemas.openxmlformats.org/officeDocument/2006/relationships" xmlns:m="http://schemas.openxmlformats.org/officeDocument/2006/math" xmlns:v="urn:schemas-microsoft-com:vml" xmlns:wp="http://schemas.openxmlformats.org/drawingml/2006/wordprocessingDrawing" xmlns:w10="urn:schemas-microsoft-com:office:word" xmlns:w="http://schemas.openxmlformats.org/wordprocessingml/2006/main" xmlns:wne="http://schemas.microsoft.com/office/word/2006/wordml">
   <w:abstractNum w:abstractNumId="0">
+    <w:nsid w:val="148D14A5"/>
+    <w:multiLevelType w:val="hybridMultilevel"/>
+    <w:tmpl w:val="5D748CEC"/>
+    <w:lvl w:ilvl="0" w:tplc="04090001">
+      <w:start w:val="1"/>
+      <w:numFmt w:val="bullet"/>
+      <w:lvlText w:val=""/>
+      <w:lvlJc w:val="left"/>
+      <w:pPr>
+        <w:ind w:left="720" w:hanging="360"/>
+      </w:pPr>
+      <w:rPr>
+        <w:rFonts w:ascii="Symbol" w:hAnsi="Symbol" w:hint="default"/>
+      </w:rPr>
+    </w:lvl>
+    <w:lvl w:ilvl="1" w:tplc="04090003" w:tentative="1">
+      <w:start w:val="1"/>
+      <w:numFmt w:val="bullet"/>
+      <w:lvlText w:val="o"/>
+      <w:lvlJc w:val="left"/>
+      <w:pPr>
+        <w:ind w:left="1440" w:hanging="360"/>
+      </w:pPr>
+      <w:rPr>
+        <w:rFonts w:ascii="Courier New" w:hAnsi="Courier New" w:cs="Courier New" w:hint="default"/>
+      </w:rPr>
+    </w:lvl>
+    <w:lvl w:ilvl="2" w:tplc="04090005" w:tentative="1">
+      <w:start w:val="1"/>
+      <w:numFmt w:val="bullet"/>
+      <w:lvlText w:val=""/>
+      <w:lvlJc w:val="left"/>
+      <w:pPr>
+        <w:ind w:left="2160" w:hanging="360"/>
+      </w:pPr>
+      <w:rPr>
+        <w:rFonts w:ascii="Wingdings" w:hAnsi="Wingdings" w:hint="default"/>
+      </w:rPr>
+    </w:lvl>
+    <w:lvl w:ilvl="3" w:tplc="04090001" w:tentative="1">
+      <w:start w:val="1"/>
+      <w:numFmt w:val="bullet"/>
+      <w:lvlText w:val=""/>
+      <w:lvlJc w:val="left"/>
+      <w:pPr>
+        <w:ind w:left="2880" w:hanging="360"/>
+      </w:pPr>
+      <w:rPr>
+        <w:rFonts w:ascii="Symbol" w:hAnsi="Symbol" w:hint="default"/>
+      </w:rPr>
+    </w:lvl>
+    <w:lvl w:ilvl="4" w:tplc="04090003" w:tentative="1">
+      <w:start w:val="1"/>
+      <w:numFmt w:val="bullet"/>
+      <w:lvlText w:val="o"/>
+      <w:lvlJc w:val="left"/>
+      <w:pPr>
+        <w:ind w:left="3600" w:hanging="360"/>
+      </w:pPr>
+      <w:rPr>
+        <w:rFonts w:ascii="Courier New" w:hAnsi="Courier New" w:cs="Courier New" w:hint="default"/>
+      </w:rPr>
+    </w:lvl>
+    <w:lvl w:ilvl="5" w:tplc="04090005" w:tentative="1">
+      <w:start w:val="1"/>
+      <w:numFmt w:val="bullet"/>
+      <w:lvlText w:val=""/>
+      <w:lvlJc w:val="left"/>
+      <w:pPr>
+        <w:ind w:left="4320" w:hanging="360"/>
+      </w:pPr>
+      <w:rPr>
+        <w:rFonts w:ascii="Wingdings" w:hAnsi="Wingdings" w:hint="default"/>
+      </w:rPr>
+    </w:lvl>
+    <w:lvl w:ilvl="6" w:tplc="04090001" w:tentative="1">
+      <w:start w:val="1"/>
+      <w:numFmt w:val="bullet"/>
+      <w:lvlText w:val=""/>
+      <w:lvlJc w:val="left"/>
+      <w:pPr>
+        <w:ind w:left="5040" w:hanging="360"/>
+      </w:pPr>
+      <w:rPr>
+        <w:rFonts w:ascii="Symbol" w:hAnsi="Symbol" w:hint="default"/>
+      </w:rPr>
+    </w:lvl>
+    <w:lvl w:ilvl="7" w:tplc="04090003" w:tentative="1">
+      <w:start w:val="1"/>
+      <w:numFmt w:val="bullet"/>
+      <w:lvlText w:val="o"/>
+      <w:lvlJc w:val="left"/>
+      <w:pPr>
+        <w:ind w:left="5760" w:hanging="360"/>
+      </w:pPr>
+      <w:rPr>
+        <w:rFonts w:ascii="Courier New" w:hAnsi="Courier New" w:cs="Courier New" w:hint="default"/>
+      </w:rPr>
+    </w:lvl>
+    <w:lvl w:ilvl="8" w:tplc="04090005" w:tentative="1">
+      <w:start w:val="1"/>
+      <w:numFmt w:val="bullet"/>
+      <w:lvlText w:val=""/>
+      <w:lvlJc w:val="left"/>
+      <w:pPr>
+        <w:ind w:left="6480" w:hanging="360"/>
+      </w:pPr>
+      <w:rPr>
+        <w:rFonts w:ascii="Wingdings" w:hAnsi="Wingdings" w:hint="default"/>
+      </w:rPr>
+    </w:lvl>
+  </w:abstractNum>
+  <w:abstractNum w:abstractNumId="1">
     <w:nsid w:val="2783055D"/>
     <w:multiLevelType w:val="hybridMultilevel"/>
     <w:tmpl w:val="E7AA1286"/>
@@ -2263,7 +2959,7 @@
       </w:rPr>
     </w:lvl>
   </w:abstractNum>
-  <w:abstractNum w:abstractNumId="1">
+  <w:abstractNum w:abstractNumId="2">
     <w:nsid w:val="68C47F62"/>
     <w:multiLevelType w:val="hybridMultilevel"/>
     <w:tmpl w:val="6F3E081E"/>
@@ -2376,7 +3072,120 @@
       </w:rPr>
     </w:lvl>
   </w:abstractNum>
-  <w:abstractNum w:abstractNumId="2">
+  <w:abstractNum w:abstractNumId="3">
+    <w:nsid w:val="71CB4786"/>
+    <w:multiLevelType w:val="hybridMultilevel"/>
+    <w:tmpl w:val="3050D5BC"/>
+    <w:lvl w:ilvl="0" w:tplc="04090001">
+      <w:start w:val="1"/>
+      <w:numFmt w:val="bullet"/>
+      <w:lvlText w:val=""/>
+      <w:lvlJc w:val="left"/>
+      <w:pPr>
+        <w:ind w:left="720" w:hanging="360"/>
+      </w:pPr>
+      <w:rPr>
+        <w:rFonts w:ascii="Symbol" w:hAnsi="Symbol" w:hint="default"/>
+      </w:rPr>
+    </w:lvl>
+    <w:lvl w:ilvl="1" w:tplc="04090003" w:tentative="1">
+      <w:start w:val="1"/>
+      <w:numFmt w:val="bullet"/>
+      <w:lvlText w:val="o"/>
+      <w:lvlJc w:val="left"/>
+      <w:pPr>
+        <w:ind w:left="1440" w:hanging="360"/>
+      </w:pPr>
+      <w:rPr>
+        <w:rFonts w:ascii="Courier New" w:hAnsi="Courier New" w:cs="Courier New" w:hint="default"/>
+      </w:rPr>
+    </w:lvl>
+    <w:lvl w:ilvl="2" w:tplc="04090005" w:tentative="1">
+      <w:start w:val="1"/>
+      <w:numFmt w:val="bullet"/>
+      <w:lvlText w:val=""/>
+      <w:lvlJc w:val="left"/>
+      <w:pPr>
+        <w:ind w:left="2160" w:hanging="360"/>
+      </w:pPr>
+      <w:rPr>
+        <w:rFonts w:ascii="Wingdings" w:hAnsi="Wingdings" w:hint="default"/>
+      </w:rPr>
+    </w:lvl>
+    <w:lvl w:ilvl="3" w:tplc="04090001" w:tentative="1">
+      <w:start w:val="1"/>
+      <w:numFmt w:val="bullet"/>
+      <w:lvlText w:val=""/>
+      <w:lvlJc w:val="left"/>
+      <w:pPr>
+        <w:ind w:left="2880" w:hanging="360"/>
+      </w:pPr>
+      <w:rPr>
+        <w:rFonts w:ascii="Symbol" w:hAnsi="Symbol" w:hint="default"/>
+      </w:rPr>
+    </w:lvl>
+    <w:lvl w:ilvl="4" w:tplc="04090003" w:tentative="1">
+      <w:start w:val="1"/>
+      <w:numFmt w:val="bullet"/>
+      <w:lvlText w:val="o"/>
+      <w:lvlJc w:val="left"/>
+      <w:pPr>
+        <w:ind w:left="3600" w:hanging="360"/>
+      </w:pPr>
+      <w:rPr>
+        <w:rFonts w:ascii="Courier New" w:hAnsi="Courier New" w:cs="Courier New" w:hint="default"/>
+      </w:rPr>
+    </w:lvl>
+    <w:lvl w:ilvl="5" w:tplc="04090005" w:tentative="1">
+      <w:start w:val="1"/>
+      <w:numFmt w:val="bullet"/>
+      <w:lvlText w:val=""/>
+      <w:lvlJc w:val="left"/>
+      <w:pPr>
+        <w:ind w:left="4320" w:hanging="360"/>
+      </w:pPr>
+      <w:rPr>
+        <w:rFonts w:ascii="Wingdings" w:hAnsi="Wingdings" w:hint="default"/>
+      </w:rPr>
+    </w:lvl>
+    <w:lvl w:ilvl="6" w:tplc="04090001" w:tentative="1">
+      <w:start w:val="1"/>
+      <w:numFmt w:val="bullet"/>
+      <w:lvlText w:val=""/>
+      <w:lvlJc w:val="left"/>
+      <w:pPr>
+        <w:ind w:left="5040" w:hanging="360"/>
+      </w:pPr>
+      <w:rPr>
+        <w:rFonts w:ascii="Symbol" w:hAnsi="Symbol" w:hint="default"/>
+      </w:rPr>
+    </w:lvl>
+    <w:lvl w:ilvl="7" w:tplc="04090003" w:tentative="1">
+      <w:start w:val="1"/>
+      <w:numFmt w:val="bullet"/>
+      <w:lvlText w:val="o"/>
+      <w:lvlJc w:val="left"/>
+      <w:pPr>
+        <w:ind w:left="5760" w:hanging="360"/>
+      </w:pPr>
+      <w:rPr>
+        <w:rFonts w:ascii="Courier New" w:hAnsi="Courier New" w:cs="Courier New" w:hint="default"/>
+      </w:rPr>
+    </w:lvl>
+    <w:lvl w:ilvl="8" w:tplc="04090005" w:tentative="1">
+      <w:start w:val="1"/>
+      <w:numFmt w:val="bullet"/>
+      <w:lvlText w:val=""/>
+      <w:lvlJc w:val="left"/>
+      <w:pPr>
+        <w:ind w:left="6480" w:hanging="360"/>
+      </w:pPr>
+      <w:rPr>
+        <w:rFonts w:ascii="Wingdings" w:hAnsi="Wingdings" w:hint="default"/>
+      </w:rPr>
+    </w:lvl>
+  </w:abstractNum>
+  <w:abstractNum w:abstractNumId="4">
     <w:nsid w:val="7D5C737A"/>
     <w:multiLevelType w:val="hybridMultilevel"/>
     <w:tmpl w:val="DE42117C"/>
@@ -2490,13 +3299,19 @@
     </w:lvl>
   </w:abstractNum>
   <w:num w:numId="1">
+    <w:abstractNumId w:val="2"/>
+  </w:num>
+  <w:num w:numId="2">
+    <w:abstractNumId w:val="4"/>
+  </w:num>
+  <w:num w:numId="3">
     <w:abstractNumId w:val="1"/>
   </w:num>
-  <w:num w:numId="2">
-    <w:abstractNumId w:val="2"/>
+  <w:num w:numId="4">
+    <w:abstractNumId w:val="0"/>
   </w:num>
-  <w:num w:numId="3">
-    <w:abstractNumId w:val="0"/>
+  <w:num w:numId="5">
+    <w:abstractNumId w:val="3"/>
   </w:num>
 </w:numbering>
 </file>

</xml_diff>

<commit_message>
Compeleted Excel Parser Service
</commit_message>
<xml_diff>
--- a/Revision Notes.docx
+++ b/Revision Notes.docx
@@ -2702,24 +2702,78 @@
           <w:sz w:val="22"/>
           <w:szCs w:val="22"/>
         </w:rPr>
-        <w:t xml:space="preserve">But this is failing throwing exception for the excel file that we are using from </w:t>
-      </w:r>
-      <w:proofErr w:type="spellStart"/>
-      <w:r>
-        <w:rPr>
-          <w:sz w:val="22"/>
-          <w:szCs w:val="22"/>
-        </w:rPr>
-        <w:t>icici</w:t>
-      </w:r>
-      <w:proofErr w:type="spellEnd"/>
-      <w:r>
-        <w:rPr>
-          <w:sz w:val="22"/>
-          <w:szCs w:val="22"/>
-        </w:rPr>
-        <w:t xml:space="preserve"> bank so need to debug further will see tomorrow. </w:t>
-      </w:r>
+        <w:t xml:space="preserve">Also updated </w:t>
+      </w:r>
+      <w:proofErr w:type="spellStart"/>
+      <w:r>
+        <w:rPr>
+          <w:sz w:val="22"/>
+          <w:szCs w:val="22"/>
+        </w:rPr>
+        <w:t>application.properties</w:t>
+      </w:r>
+      <w:proofErr w:type="spellEnd"/>
+      <w:r>
+        <w:rPr>
+          <w:sz w:val="22"/>
+          <w:szCs w:val="22"/>
+        </w:rPr>
+        <w:t xml:space="preserve"> in order to stop receiving the spring security generated password a default user username is user and password is system generated by it so in order to stop it declared username and password in this file</w:t>
+      </w:r>
+    </w:p>
+    <w:p>
+      <w:pPr>
+        <w:pStyle w:val="ListParagraph"/>
+        <w:numPr>
+          <w:ilvl w:val="0"/>
+          <w:numId w:val="5"/>
+        </w:numPr>
+        <w:rPr>
+          <w:b/>
+          <w:bCs/>
+          <w:sz w:val="22"/>
+          <w:szCs w:val="22"/>
+        </w:rPr>
+      </w:pPr>
+      <w:r>
+        <w:rPr>
+          <w:sz w:val="22"/>
+          <w:szCs w:val="22"/>
+        </w:rPr>
+        <w:t>The excel file parsing was failing so added exception handling to avoid breaking at the end of table when legends were encountered.</w:t>
+      </w:r>
+    </w:p>
+    <w:p>
+      <w:pPr>
+        <w:pStyle w:val="ListParagraph"/>
+        <w:numPr>
+          <w:ilvl w:val="0"/>
+          <w:numId w:val="5"/>
+        </w:numPr>
+        <w:rPr>
+          <w:b/>
+          <w:bCs/>
+          <w:sz w:val="22"/>
+          <w:szCs w:val="22"/>
+        </w:rPr>
+      </w:pPr>
+      <w:r>
+        <w:rPr>
+          <w:sz w:val="22"/>
+          <w:szCs w:val="22"/>
+        </w:rPr>
+        <w:t>The exception should be later on replaced by some good logic instead as of now it’s done.</w:t>
+      </w:r>
+    </w:p>
+    <w:p>
+      <w:pPr>
+        <w:rPr>
+          <w:b/>
+          <w:bCs/>
+          <w:sz w:val="22"/>
+          <w:szCs w:val="22"/>
+        </w:rPr>
+      </w:pPr>
     </w:p>
     <w:sectPr>
       <w:pgSz w:w="11906" w:h="16838"/>

</xml_diff>

<commit_message>
Updated transaction package with mer name & ctg
</commit_message>
<xml_diff>
--- a/Revision Notes.docx
+++ b/Revision Notes.docx
@@ -2774,6 +2774,574 @@
           <w:szCs w:val="22"/>
         </w:rPr>
       </w:pPr>
+      <w:r>
+        <w:rPr>
+          <w:b/>
+          <w:bCs/>
+          <w:sz w:val="22"/>
+          <w:szCs w:val="22"/>
+        </w:rPr>
+        <w:lastRenderedPageBreak/>
+        <w:t>Stuff did on 30/06/2026:</w:t>
+      </w:r>
+    </w:p>
+    <w:p>
+      <w:pPr>
+        <w:pStyle w:val="ListParagraph"/>
+        <w:numPr>
+          <w:ilvl w:val="0"/>
+          <w:numId w:val="6"/>
+        </w:numPr>
+        <w:rPr>
+          <w:sz w:val="22"/>
+          <w:szCs w:val="22"/>
+        </w:rPr>
+      </w:pPr>
+      <w:r>
+        <w:rPr>
+          <w:sz w:val="22"/>
+          <w:szCs w:val="22"/>
+        </w:rPr>
+        <w:t xml:space="preserve">Updated </w:t>
+      </w:r>
+      <w:proofErr w:type="spellStart"/>
+      <w:r>
+        <w:rPr>
+          <w:sz w:val="22"/>
+          <w:szCs w:val="22"/>
+        </w:rPr>
+        <w:t>TransactionMapper</w:t>
+      </w:r>
+      <w:proofErr w:type="spellEnd"/>
+      <w:r>
+        <w:rPr>
+          <w:sz w:val="22"/>
+          <w:szCs w:val="22"/>
+        </w:rPr>
+        <w:t xml:space="preserve"> to map all values from </w:t>
+      </w:r>
+      <w:proofErr w:type="spellStart"/>
+      <w:r>
+        <w:rPr>
+          <w:sz w:val="22"/>
+          <w:szCs w:val="22"/>
+        </w:rPr>
+        <w:t>excelRow</w:t>
+      </w:r>
+      <w:proofErr w:type="spellEnd"/>
+      <w:r>
+        <w:rPr>
+          <w:sz w:val="22"/>
+          <w:szCs w:val="22"/>
+        </w:rPr>
+        <w:t xml:space="preserve"> to transaction only </w:t>
+      </w:r>
+      <w:proofErr w:type="spellStart"/>
+      <w:r>
+        <w:rPr>
+          <w:sz w:val="22"/>
+          <w:szCs w:val="22"/>
+        </w:rPr>
+        <w:t>merchantName</w:t>
+      </w:r>
+      <w:proofErr w:type="spellEnd"/>
+      <w:r>
+        <w:rPr>
+          <w:sz w:val="22"/>
+          <w:szCs w:val="22"/>
+        </w:rPr>
+        <w:t xml:space="preserve"> is pending.</w:t>
+      </w:r>
+    </w:p>
+    <w:p>
+      <w:pPr>
+        <w:pStyle w:val="ListParagraph"/>
+        <w:numPr>
+          <w:ilvl w:val="0"/>
+          <w:numId w:val="6"/>
+        </w:numPr>
+        <w:rPr>
+          <w:sz w:val="22"/>
+          <w:szCs w:val="22"/>
+        </w:rPr>
+      </w:pPr>
+      <w:r>
+        <w:rPr>
+          <w:sz w:val="22"/>
+          <w:szCs w:val="22"/>
+        </w:rPr>
+        <w:t xml:space="preserve">Created </w:t>
+      </w:r>
+      <w:proofErr w:type="spellStart"/>
+      <w:r>
+        <w:rPr>
+          <w:sz w:val="22"/>
+          <w:szCs w:val="22"/>
+        </w:rPr>
+        <w:t>MerchantExtractor</w:t>
+      </w:r>
+      <w:proofErr w:type="spellEnd"/>
+      <w:r>
+        <w:rPr>
+          <w:sz w:val="22"/>
+          <w:szCs w:val="22"/>
+        </w:rPr>
+        <w:t xml:space="preserve"> to retrieve name of merchant from remarks.</w:t>
+      </w:r>
+    </w:p>
+    <w:p>
+      <w:pPr>
+        <w:pStyle w:val="ListParagraph"/>
+        <w:numPr>
+          <w:ilvl w:val="0"/>
+          <w:numId w:val="6"/>
+        </w:numPr>
+        <w:rPr>
+          <w:sz w:val="22"/>
+          <w:szCs w:val="22"/>
+        </w:rPr>
+      </w:pPr>
+      <w:r>
+        <w:rPr>
+          <w:sz w:val="22"/>
+          <w:szCs w:val="22"/>
+        </w:rPr>
+        <w:t xml:space="preserve">Created </w:t>
+      </w:r>
+      <w:proofErr w:type="spellStart"/>
+      <w:r>
+        <w:rPr>
+          <w:sz w:val="22"/>
+          <w:szCs w:val="22"/>
+        </w:rPr>
+        <w:t>InvalidTransactionAmountException</w:t>
+      </w:r>
+      <w:proofErr w:type="spellEnd"/>
+      <w:r>
+        <w:rPr>
+          <w:sz w:val="22"/>
+          <w:szCs w:val="22"/>
+        </w:rPr>
+        <w:t xml:space="preserve"> – we shouldn’t use names which are already present in other projects/dependencies or it will cause confusion.</w:t>
+      </w:r>
+    </w:p>
+    <w:p>
+      <w:pPr>
+        <w:pStyle w:val="ListParagraph"/>
+        <w:numPr>
+          <w:ilvl w:val="0"/>
+          <w:numId w:val="6"/>
+        </w:numPr>
+        <w:rPr>
+          <w:sz w:val="22"/>
+          <w:szCs w:val="22"/>
+        </w:rPr>
+      </w:pPr>
+      <w:r>
+        <w:rPr>
+          <w:sz w:val="22"/>
+          <w:szCs w:val="22"/>
+        </w:rPr>
+        <w:t xml:space="preserve">Created </w:t>
+      </w:r>
+      <w:proofErr w:type="spellStart"/>
+      <w:r>
+        <w:rPr>
+          <w:sz w:val="22"/>
+          <w:szCs w:val="22"/>
+        </w:rPr>
+        <w:t>CategoryRuleEngin</w:t>
+      </w:r>
+      <w:r>
+        <w:rPr>
+          <w:sz w:val="22"/>
+          <w:szCs w:val="22"/>
+        </w:rPr>
+        <w:t>e</w:t>
+      </w:r>
+      <w:proofErr w:type="spellEnd"/>
+    </w:p>
+    <w:p>
+      <w:pPr>
+        <w:rPr>
+          <w:sz w:val="22"/>
+          <w:szCs w:val="22"/>
+        </w:rPr>
+      </w:pPr>
+    </w:p>
+    <w:p>
+      <w:pPr>
+        <w:rPr>
+          <w:b/>
+          <w:bCs/>
+          <w:sz w:val="22"/>
+          <w:szCs w:val="22"/>
+        </w:rPr>
+      </w:pPr>
+      <w:r>
+        <w:rPr>
+          <w:b/>
+          <w:bCs/>
+          <w:sz w:val="22"/>
+          <w:szCs w:val="22"/>
+        </w:rPr>
+        <w:t>Stuff did on 08/07/2026:</w:t>
+      </w:r>
+    </w:p>
+    <w:p>
+      <w:pPr>
+        <w:pStyle w:val="ListParagraph"/>
+        <w:numPr>
+          <w:ilvl w:val="0"/>
+          <w:numId w:val="6"/>
+        </w:numPr>
+        <w:rPr>
+          <w:sz w:val="22"/>
+          <w:szCs w:val="22"/>
+        </w:rPr>
+      </w:pPr>
+      <w:r>
+        <w:rPr>
+          <w:sz w:val="22"/>
+          <w:szCs w:val="22"/>
+        </w:rPr>
+        <w:t xml:space="preserve">Renamed </w:t>
+      </w:r>
+      <w:proofErr w:type="spellStart"/>
+      <w:r>
+        <w:rPr>
+          <w:sz w:val="22"/>
+          <w:szCs w:val="22"/>
+        </w:rPr>
+        <w:t>CategoryRuleEngine</w:t>
+      </w:r>
+      <w:proofErr w:type="spellEnd"/>
+      <w:r>
+        <w:rPr>
+          <w:sz w:val="22"/>
+          <w:szCs w:val="22"/>
+        </w:rPr>
+        <w:t xml:space="preserve"> to </w:t>
+      </w:r>
+      <w:proofErr w:type="spellStart"/>
+      <w:r>
+        <w:rPr>
+          <w:sz w:val="22"/>
+          <w:szCs w:val="22"/>
+        </w:rPr>
+        <w:t>MerchantCategorizer</w:t>
+      </w:r>
+      <w:proofErr w:type="spellEnd"/>
+    </w:p>
+    <w:p>
+      <w:pPr>
+        <w:pStyle w:val="ListParagraph"/>
+        <w:numPr>
+          <w:ilvl w:val="0"/>
+          <w:numId w:val="6"/>
+        </w:numPr>
+        <w:rPr>
+          <w:sz w:val="22"/>
+          <w:szCs w:val="22"/>
+        </w:rPr>
+      </w:pPr>
+      <w:r>
+        <w:rPr>
+          <w:sz w:val="22"/>
+          <w:szCs w:val="22"/>
+        </w:rPr>
+        <w:t xml:space="preserve">Deleted the category table – removed </w:t>
+      </w:r>
+      <w:proofErr w:type="spellStart"/>
+      <w:r>
+        <w:rPr>
+          <w:sz w:val="22"/>
+          <w:szCs w:val="22"/>
+        </w:rPr>
+        <w:t>category_id</w:t>
+      </w:r>
+      <w:proofErr w:type="spellEnd"/>
+      <w:r>
+        <w:rPr>
+          <w:sz w:val="22"/>
+          <w:szCs w:val="22"/>
+        </w:rPr>
+        <w:t xml:space="preserve"> FK from transaction table</w:t>
+      </w:r>
+    </w:p>
+    <w:p>
+      <w:pPr>
+        <w:pStyle w:val="ListParagraph"/>
+        <w:numPr>
+          <w:ilvl w:val="0"/>
+          <w:numId w:val="6"/>
+        </w:numPr>
+        <w:rPr>
+          <w:sz w:val="22"/>
+          <w:szCs w:val="22"/>
+        </w:rPr>
+      </w:pPr>
+      <w:r>
+        <w:rPr>
+          <w:sz w:val="22"/>
+          <w:szCs w:val="22"/>
+        </w:rPr>
+        <w:t xml:space="preserve">Added </w:t>
+      </w:r>
+      <w:proofErr w:type="spellStart"/>
+      <w:r>
+        <w:rPr>
+          <w:sz w:val="22"/>
+          <w:szCs w:val="22"/>
+        </w:rPr>
+        <w:t>CategoryType</w:t>
+      </w:r>
+      <w:proofErr w:type="spellEnd"/>
+      <w:r>
+        <w:rPr>
+          <w:sz w:val="22"/>
+          <w:szCs w:val="22"/>
+        </w:rPr>
+        <w:t xml:space="preserve"> </w:t>
+      </w:r>
+      <w:proofErr w:type="spellStart"/>
+      <w:r>
+        <w:rPr>
+          <w:sz w:val="22"/>
+          <w:szCs w:val="22"/>
+        </w:rPr>
+        <w:t>Enum</w:t>
+      </w:r>
+      <w:proofErr w:type="spellEnd"/>
+      <w:r>
+        <w:rPr>
+          <w:sz w:val="22"/>
+          <w:szCs w:val="22"/>
+        </w:rPr>
+        <w:t xml:space="preserve"> and used that </w:t>
+      </w:r>
+      <w:proofErr w:type="spellStart"/>
+      <w:r>
+        <w:rPr>
+          <w:sz w:val="22"/>
+          <w:szCs w:val="22"/>
+        </w:rPr>
+        <w:t>enum</w:t>
+      </w:r>
+      <w:proofErr w:type="spellEnd"/>
+      <w:r>
+        <w:rPr>
+          <w:sz w:val="22"/>
+          <w:szCs w:val="22"/>
+        </w:rPr>
+        <w:t xml:space="preserve"> in the table with @Enumerated(</w:t>
+      </w:r>
+      <w:proofErr w:type="spellStart"/>
+      <w:r>
+        <w:rPr>
+          <w:sz w:val="22"/>
+          <w:szCs w:val="22"/>
+        </w:rPr>
+        <w:t>EnumType.STRING</w:t>
+      </w:r>
+      <w:proofErr w:type="spellEnd"/>
+      <w:r>
+        <w:rPr>
+          <w:sz w:val="22"/>
+          <w:szCs w:val="22"/>
+        </w:rPr>
+        <w:t xml:space="preserve">) annotation – it tells JPA to map this </w:t>
+      </w:r>
+      <w:proofErr w:type="spellStart"/>
+      <w:r>
+        <w:rPr>
+          <w:sz w:val="22"/>
+          <w:szCs w:val="22"/>
+        </w:rPr>
+        <w:t>enum</w:t>
+      </w:r>
+      <w:proofErr w:type="spellEnd"/>
+      <w:r>
+        <w:rPr>
+          <w:sz w:val="22"/>
+          <w:szCs w:val="22"/>
+        </w:rPr>
+        <w:t xml:space="preserve"> into table column and </w:t>
+      </w:r>
+      <w:proofErr w:type="spellStart"/>
+      <w:r>
+        <w:rPr>
+          <w:sz w:val="22"/>
+          <w:szCs w:val="22"/>
+        </w:rPr>
+        <w:t>EnumType.STRING</w:t>
+      </w:r>
+      <w:proofErr w:type="spellEnd"/>
+      <w:r>
+        <w:rPr>
+          <w:sz w:val="22"/>
+          <w:szCs w:val="22"/>
+        </w:rPr>
+        <w:t xml:space="preserve"> means store the </w:t>
+      </w:r>
+      <w:proofErr w:type="spellStart"/>
+      <w:r>
+        <w:rPr>
+          <w:sz w:val="22"/>
+          <w:szCs w:val="22"/>
+        </w:rPr>
+        <w:t>enum</w:t>
+      </w:r>
+      <w:proofErr w:type="spellEnd"/>
+      <w:r>
+        <w:rPr>
+          <w:sz w:val="22"/>
+          <w:szCs w:val="22"/>
+        </w:rPr>
+        <w:t xml:space="preserve"> names as it is. And there’s one more the </w:t>
+      </w:r>
+      <w:proofErr w:type="spellStart"/>
+      <w:r>
+        <w:rPr>
+          <w:sz w:val="22"/>
+          <w:szCs w:val="22"/>
+        </w:rPr>
+        <w:t>EnumType.ORDINAL</w:t>
+      </w:r>
+      <w:proofErr w:type="spellEnd"/>
+      <w:r>
+        <w:rPr>
+          <w:sz w:val="22"/>
+          <w:szCs w:val="22"/>
+        </w:rPr>
+        <w:t xml:space="preserve"> which mean don’t store the name but store it’s index</w:t>
+      </w:r>
+    </w:p>
+    <w:p>
+      <w:pPr>
+        <w:pStyle w:val="ListParagraph"/>
+        <w:numPr>
+          <w:ilvl w:val="0"/>
+          <w:numId w:val="6"/>
+        </w:numPr>
+        <w:rPr>
+          <w:sz w:val="22"/>
+          <w:szCs w:val="22"/>
+        </w:rPr>
+      </w:pPr>
+      <w:r>
+        <w:rPr>
+          <w:sz w:val="22"/>
+          <w:szCs w:val="22"/>
+        </w:rPr>
+        <w:t xml:space="preserve">Created a map in </w:t>
+      </w:r>
+      <w:proofErr w:type="spellStart"/>
+      <w:r>
+        <w:rPr>
+          <w:sz w:val="22"/>
+          <w:szCs w:val="22"/>
+        </w:rPr>
+        <w:t>MerchantCategorizer</w:t>
+      </w:r>
+      <w:proofErr w:type="spellEnd"/>
+      <w:r>
+        <w:rPr>
+          <w:sz w:val="22"/>
+          <w:szCs w:val="22"/>
+        </w:rPr>
+        <w:t xml:space="preserve"> and hardcoded many merchant names along with their category type</w:t>
+      </w:r>
+    </w:p>
+    <w:p>
+      <w:pPr>
+        <w:pStyle w:val="ListParagraph"/>
+        <w:numPr>
+          <w:ilvl w:val="0"/>
+          <w:numId w:val="6"/>
+        </w:numPr>
+        <w:rPr>
+          <w:sz w:val="22"/>
+          <w:szCs w:val="22"/>
+        </w:rPr>
+      </w:pPr>
+      <w:r>
+        <w:rPr>
+          <w:sz w:val="22"/>
+          <w:szCs w:val="22"/>
+        </w:rPr>
+        <w:t xml:space="preserve">Created method </w:t>
+      </w:r>
+      <w:proofErr w:type="spellStart"/>
+      <w:proofErr w:type="gramStart"/>
+      <w:r>
+        <w:rPr>
+          <w:sz w:val="22"/>
+          <w:szCs w:val="22"/>
+        </w:rPr>
+        <w:t>determineCategory</w:t>
+      </w:r>
+      <w:proofErr w:type="spellEnd"/>
+      <w:r>
+        <w:rPr>
+          <w:sz w:val="22"/>
+          <w:szCs w:val="22"/>
+        </w:rPr>
+        <w:t>(</w:t>
+      </w:r>
+      <w:proofErr w:type="gramEnd"/>
+      <w:r>
+        <w:rPr>
+          <w:sz w:val="22"/>
+          <w:szCs w:val="22"/>
+        </w:rPr>
+        <w:t>) to find the category of merchant.</w:t>
+      </w:r>
+    </w:p>
+    <w:p>
+      <w:pPr>
+        <w:pStyle w:val="ListParagraph"/>
+        <w:numPr>
+          <w:ilvl w:val="0"/>
+          <w:numId w:val="6"/>
+        </w:numPr>
+        <w:rPr>
+          <w:sz w:val="22"/>
+          <w:szCs w:val="22"/>
+        </w:rPr>
+      </w:pPr>
+      <w:r>
+        <w:rPr>
+          <w:sz w:val="22"/>
+          <w:szCs w:val="22"/>
+        </w:rPr>
+        <w:t xml:space="preserve">Did mapping for merchant name and transaction category in transaction </w:t>
+      </w:r>
+      <w:proofErr w:type="spellStart"/>
+      <w:r>
+        <w:rPr>
+          <w:sz w:val="22"/>
+          <w:szCs w:val="22"/>
+        </w:rPr>
+        <w:t>Mapper</w:t>
+      </w:r>
+      <w:proofErr w:type="spellEnd"/>
+      <w:r>
+        <w:rPr>
+          <w:sz w:val="22"/>
+          <w:szCs w:val="22"/>
+        </w:rPr>
+        <w:t xml:space="preserve"> class.</w:t>
+      </w:r>
+    </w:p>
+    <w:p>
+      <w:pPr>
+        <w:pStyle w:val="ListParagraph"/>
+        <w:rPr>
+          <w:sz w:val="22"/>
+          <w:szCs w:val="22"/>
+        </w:rPr>
+      </w:pPr>
     </w:p>
     <w:sectPr>
       <w:pgSz w:w="11906" w:h="16838"/>
@@ -3014,6 +3582,119 @@
     </w:lvl>
   </w:abstractNum>
   <w:abstractNum w:abstractNumId="2">
+    <w:nsid w:val="27FD49D8"/>
+    <w:multiLevelType w:val="hybridMultilevel"/>
+    <w:tmpl w:val="2C4CEA74"/>
+    <w:lvl w:ilvl="0" w:tplc="04090001">
+      <w:start w:val="1"/>
+      <w:numFmt w:val="bullet"/>
+      <w:lvlText w:val=""/>
+      <w:lvlJc w:val="left"/>
+      <w:pPr>
+        <w:ind w:left="720" w:hanging="360"/>
+      </w:pPr>
+      <w:rPr>
+        <w:rFonts w:ascii="Symbol" w:hAnsi="Symbol" w:hint="default"/>
+      </w:rPr>
+    </w:lvl>
+    <w:lvl w:ilvl="1" w:tplc="04090003" w:tentative="1">
+      <w:start w:val="1"/>
+      <w:numFmt w:val="bullet"/>
+      <w:lvlText w:val="o"/>
+      <w:lvlJc w:val="left"/>
+      <w:pPr>
+        <w:ind w:left="1440" w:hanging="360"/>
+      </w:pPr>
+      <w:rPr>
+        <w:rFonts w:ascii="Courier New" w:hAnsi="Courier New" w:cs="Courier New" w:hint="default"/>
+      </w:rPr>
+    </w:lvl>
+    <w:lvl w:ilvl="2" w:tplc="04090005" w:tentative="1">
+      <w:start w:val="1"/>
+      <w:numFmt w:val="bullet"/>
+      <w:lvlText w:val=""/>
+      <w:lvlJc w:val="left"/>
+      <w:pPr>
+        <w:ind w:left="2160" w:hanging="360"/>
+      </w:pPr>
+      <w:rPr>
+        <w:rFonts w:ascii="Wingdings" w:hAnsi="Wingdings" w:hint="default"/>
+      </w:rPr>
+    </w:lvl>
+    <w:lvl w:ilvl="3" w:tplc="04090001" w:tentative="1">
+      <w:start w:val="1"/>
+      <w:numFmt w:val="bullet"/>
+      <w:lvlText w:val=""/>
+      <w:lvlJc w:val="left"/>
+      <w:pPr>
+        <w:ind w:left="2880" w:hanging="360"/>
+      </w:pPr>
+      <w:rPr>
+        <w:rFonts w:ascii="Symbol" w:hAnsi="Symbol" w:hint="default"/>
+      </w:rPr>
+    </w:lvl>
+    <w:lvl w:ilvl="4" w:tplc="04090003" w:tentative="1">
+      <w:start w:val="1"/>
+      <w:numFmt w:val="bullet"/>
+      <w:lvlText w:val="o"/>
+      <w:lvlJc w:val="left"/>
+      <w:pPr>
+        <w:ind w:left="3600" w:hanging="360"/>
+      </w:pPr>
+      <w:rPr>
+        <w:rFonts w:ascii="Courier New" w:hAnsi="Courier New" w:cs="Courier New" w:hint="default"/>
+      </w:rPr>
+    </w:lvl>
+    <w:lvl w:ilvl="5" w:tplc="04090005" w:tentative="1">
+      <w:start w:val="1"/>
+      <w:numFmt w:val="bullet"/>
+      <w:lvlText w:val=""/>
+      <w:lvlJc w:val="left"/>
+      <w:pPr>
+        <w:ind w:left="4320" w:hanging="360"/>
+      </w:pPr>
+      <w:rPr>
+        <w:rFonts w:ascii="Wingdings" w:hAnsi="Wingdings" w:hint="default"/>
+      </w:rPr>
+    </w:lvl>
+    <w:lvl w:ilvl="6" w:tplc="04090001" w:tentative="1">
+      <w:start w:val="1"/>
+      <w:numFmt w:val="bullet"/>
+      <w:lvlText w:val=""/>
+      <w:lvlJc w:val="left"/>
+      <w:pPr>
+        <w:ind w:left="5040" w:hanging="360"/>
+      </w:pPr>
+      <w:rPr>
+        <w:rFonts w:ascii="Symbol" w:hAnsi="Symbol" w:hint="default"/>
+      </w:rPr>
+    </w:lvl>
+    <w:lvl w:ilvl="7" w:tplc="04090003" w:tentative="1">
+      <w:start w:val="1"/>
+      <w:numFmt w:val="bullet"/>
+      <w:lvlText w:val="o"/>
+      <w:lvlJc w:val="left"/>
+      <w:pPr>
+        <w:ind w:left="5760" w:hanging="360"/>
+      </w:pPr>
+      <w:rPr>
+        <w:rFonts w:ascii="Courier New" w:hAnsi="Courier New" w:cs="Courier New" w:hint="default"/>
+      </w:rPr>
+    </w:lvl>
+    <w:lvl w:ilvl="8" w:tplc="04090005" w:tentative="1">
+      <w:start w:val="1"/>
+      <w:numFmt w:val="bullet"/>
+      <w:lvlText w:val=""/>
+      <w:lvlJc w:val="left"/>
+      <w:pPr>
+        <w:ind w:left="6480" w:hanging="360"/>
+      </w:pPr>
+      <w:rPr>
+        <w:rFonts w:ascii="Wingdings" w:hAnsi="Wingdings" w:hint="default"/>
+      </w:rPr>
+    </w:lvl>
+  </w:abstractNum>
+  <w:abstractNum w:abstractNumId="3">
     <w:nsid w:val="68C47F62"/>
     <w:multiLevelType w:val="hybridMultilevel"/>
     <w:tmpl w:val="6F3E081E"/>
@@ -3126,7 +3807,7 @@
       </w:rPr>
     </w:lvl>
   </w:abstractNum>
-  <w:abstractNum w:abstractNumId="3">
+  <w:abstractNum w:abstractNumId="4">
     <w:nsid w:val="71CB4786"/>
     <w:multiLevelType w:val="hybridMultilevel"/>
     <w:tmpl w:val="3050D5BC"/>
@@ -3239,7 +3920,7 @@
       </w:rPr>
     </w:lvl>
   </w:abstractNum>
-  <w:abstractNum w:abstractNumId="4">
+  <w:abstractNum w:abstractNumId="5">
     <w:nsid w:val="7D5C737A"/>
     <w:multiLevelType w:val="hybridMultilevel"/>
     <w:tmpl w:val="DE42117C"/>
@@ -3353,10 +4034,10 @@
     </w:lvl>
   </w:abstractNum>
   <w:num w:numId="1">
-    <w:abstractNumId w:val="2"/>
+    <w:abstractNumId w:val="3"/>
   </w:num>
   <w:num w:numId="2">
-    <w:abstractNumId w:val="4"/>
+    <w:abstractNumId w:val="5"/>
   </w:num>
   <w:num w:numId="3">
     <w:abstractNumId w:val="1"/>
@@ -3365,7 +4046,10 @@
     <w:abstractNumId w:val="0"/>
   </w:num>
   <w:num w:numId="5">
-    <w:abstractNumId w:val="3"/>
+    <w:abstractNumId w:val="4"/>
+  </w:num>
+  <w:num w:numId="6">
+    <w:abstractNumId w:val="2"/>
   </w:num>
 </w:numbering>
 </file>
@@ -3915,7 +4599,7 @@
   <a:extraClrSchemeLst/>
   <a:extLst>
     <a:ext uri="{05A4C25C-085E-4340-85A3-A5531E510DB2}">
-      <thm15:themeFamily xmlns:thm15="http://schemas.microsoft.com/office/thememl/2012/main" xmlns="" name="Office Theme" id="{2E142A2C-CD16-42D6-873A-C26D2A0506FA}" vid="{1BDDFF52-6CD6-40A5-AB3C-68EB2F1E4D0A}"/>
+      <thm15:themeFamily xmlns="" xmlns:thm15="http://schemas.microsoft.com/office/thememl/2012/main" name="Office Theme" id="{2E142A2C-CD16-42D6-873A-C26D2A0506FA}" vid="{1BDDFF52-6CD6-40A5-AB3C-68EB2F1E4D0A}"/>
     </a:ext>
   </a:extLst>
 </a:theme>

</xml_diff>

<commit_message>
Refactored code and updated transaction service
</commit_message>
<xml_diff>
--- a/Revision Notes.docx
+++ b/Revision Notes.docx
@@ -3336,12 +3336,407 @@
     </w:p>
     <w:p>
       <w:pPr>
-        <w:pStyle w:val="ListParagraph"/>
-        <w:rPr>
-          <w:sz w:val="22"/>
-          <w:szCs w:val="22"/>
-        </w:rPr>
-      </w:pPr>
+        <w:rPr>
+          <w:sz w:val="22"/>
+          <w:szCs w:val="22"/>
+        </w:rPr>
+      </w:pPr>
+    </w:p>
+    <w:p>
+      <w:pPr>
+        <w:rPr>
+          <w:b/>
+          <w:bCs/>
+          <w:sz w:val="22"/>
+          <w:szCs w:val="22"/>
+        </w:rPr>
+      </w:pPr>
+      <w:r>
+        <w:rPr>
+          <w:b/>
+          <w:bCs/>
+          <w:sz w:val="22"/>
+          <w:szCs w:val="22"/>
+        </w:rPr>
+        <w:t>Stuff did on 10/07/2026:</w:t>
+      </w:r>
+    </w:p>
+    <w:p>
+      <w:pPr>
+        <w:pStyle w:val="ListParagraph"/>
+        <w:numPr>
+          <w:ilvl w:val="0"/>
+          <w:numId w:val="7"/>
+        </w:numPr>
+        <w:rPr>
+          <w:sz w:val="22"/>
+          <w:szCs w:val="22"/>
+        </w:rPr>
+      </w:pPr>
+      <w:r>
+        <w:rPr>
+          <w:sz w:val="22"/>
+          <w:szCs w:val="22"/>
+        </w:rPr>
+        <w:t xml:space="preserve">Today </w:t>
+      </w:r>
+      <w:proofErr w:type="spellStart"/>
+      <w:r>
+        <w:rPr>
+          <w:sz w:val="22"/>
+          <w:szCs w:val="22"/>
+        </w:rPr>
+        <w:t>refactored</w:t>
+      </w:r>
+      <w:proofErr w:type="spellEnd"/>
+      <w:r>
+        <w:rPr>
+          <w:sz w:val="22"/>
+          <w:szCs w:val="22"/>
+        </w:rPr>
+        <w:t xml:space="preserve"> the </w:t>
+      </w:r>
+      <w:proofErr w:type="spellStart"/>
+      <w:r>
+        <w:rPr>
+          <w:sz w:val="22"/>
+          <w:szCs w:val="22"/>
+        </w:rPr>
+        <w:t>TransactionMapper</w:t>
+      </w:r>
+      <w:proofErr w:type="spellEnd"/>
+      <w:r>
+        <w:rPr>
+          <w:sz w:val="22"/>
+          <w:szCs w:val="22"/>
+        </w:rPr>
+        <w:t xml:space="preserve"> service – removed the </w:t>
+      </w:r>
+      <w:proofErr w:type="spellStart"/>
+      <w:r>
+        <w:rPr>
+          <w:sz w:val="22"/>
+          <w:szCs w:val="22"/>
+        </w:rPr>
+        <w:t>merchantExtractor</w:t>
+      </w:r>
+      <w:proofErr w:type="spellEnd"/>
+      <w:r>
+        <w:rPr>
+          <w:sz w:val="22"/>
+          <w:szCs w:val="22"/>
+        </w:rPr>
+        <w:t xml:space="preserve"> and </w:t>
+      </w:r>
+      <w:proofErr w:type="spellStart"/>
+      <w:r>
+        <w:rPr>
+          <w:sz w:val="22"/>
+          <w:szCs w:val="22"/>
+        </w:rPr>
+        <w:t>merchantCategorizer</w:t>
+      </w:r>
+      <w:proofErr w:type="spellEnd"/>
+      <w:r>
+        <w:rPr>
+          <w:sz w:val="22"/>
+          <w:szCs w:val="22"/>
+        </w:rPr>
+        <w:t xml:space="preserve"> and shifted it to transaction Service – which will be the orchestrator of all different work logic rest all of the services will be doing only one task and will follow Single Responsibility Principle.</w:t>
+      </w:r>
+    </w:p>
+    <w:p>
+      <w:pPr>
+        <w:pStyle w:val="ListParagraph"/>
+        <w:numPr>
+          <w:ilvl w:val="0"/>
+          <w:numId w:val="7"/>
+        </w:numPr>
+        <w:rPr>
+          <w:sz w:val="22"/>
+          <w:szCs w:val="22"/>
+        </w:rPr>
+      </w:pPr>
+      <w:proofErr w:type="gramStart"/>
+      <w:r>
+        <w:rPr>
+          <w:sz w:val="22"/>
+          <w:szCs w:val="22"/>
+        </w:rPr>
+        <w:t>Transaction</w:t>
+      </w:r>
+      <w:proofErr w:type="gramEnd"/>
+      <w:r>
+        <w:rPr>
+          <w:sz w:val="22"/>
+          <w:szCs w:val="22"/>
+        </w:rPr>
+        <w:t xml:space="preserve"> </w:t>
+      </w:r>
+      <w:proofErr w:type="spellStart"/>
+      <w:r>
+        <w:rPr>
+          <w:sz w:val="22"/>
+          <w:szCs w:val="22"/>
+        </w:rPr>
+        <w:t>Mapper</w:t>
+      </w:r>
+      <w:proofErr w:type="spellEnd"/>
+      <w:r>
+        <w:rPr>
+          <w:sz w:val="22"/>
+          <w:szCs w:val="22"/>
+        </w:rPr>
+        <w:t xml:space="preserve"> will take excel row, merchant name and category and map everything to a Transaction entity and return back a single transaction.</w:t>
+      </w:r>
+    </w:p>
+    <w:p>
+      <w:pPr>
+        <w:pStyle w:val="ListParagraph"/>
+        <w:numPr>
+          <w:ilvl w:val="0"/>
+          <w:numId w:val="7"/>
+        </w:numPr>
+        <w:rPr>
+          <w:sz w:val="22"/>
+          <w:szCs w:val="22"/>
+        </w:rPr>
+      </w:pPr>
+      <w:r>
+        <w:rPr>
+          <w:sz w:val="22"/>
+          <w:szCs w:val="22"/>
+        </w:rPr>
+        <w:t xml:space="preserve">In transaction service we will loop through the returned </w:t>
+      </w:r>
+      <w:proofErr w:type="spellStart"/>
+      <w:r>
+        <w:rPr>
+          <w:sz w:val="22"/>
+          <w:szCs w:val="22"/>
+        </w:rPr>
+        <w:t>ExcelRow</w:t>
+      </w:r>
+      <w:proofErr w:type="spellEnd"/>
+      <w:r>
+        <w:rPr>
+          <w:sz w:val="22"/>
+          <w:szCs w:val="22"/>
+        </w:rPr>
+        <w:t xml:space="preserve"> DTO list and then will pass the remarks to </w:t>
+      </w:r>
+      <w:proofErr w:type="spellStart"/>
+      <w:r>
+        <w:rPr>
+          <w:sz w:val="22"/>
+          <w:szCs w:val="22"/>
+        </w:rPr>
+        <w:t>merchantExtractor</w:t>
+      </w:r>
+      <w:proofErr w:type="spellEnd"/>
+      <w:r>
+        <w:rPr>
+          <w:sz w:val="22"/>
+          <w:szCs w:val="22"/>
+        </w:rPr>
+        <w:t xml:space="preserve"> it will return us the </w:t>
+      </w:r>
+      <w:proofErr w:type="spellStart"/>
+      <w:r>
+        <w:rPr>
+          <w:sz w:val="22"/>
+          <w:szCs w:val="22"/>
+        </w:rPr>
+        <w:t>MerchantName</w:t>
+      </w:r>
+      <w:proofErr w:type="spellEnd"/>
+      <w:r>
+        <w:rPr>
+          <w:sz w:val="22"/>
+          <w:szCs w:val="22"/>
+        </w:rPr>
+        <w:t xml:space="preserve"> and then we pass the merchant name to </w:t>
+      </w:r>
+      <w:proofErr w:type="spellStart"/>
+      <w:r>
+        <w:rPr>
+          <w:sz w:val="22"/>
+          <w:szCs w:val="22"/>
+        </w:rPr>
+        <w:t>merchantCategorizer</w:t>
+      </w:r>
+      <w:proofErr w:type="spellEnd"/>
+      <w:r>
+        <w:rPr>
+          <w:sz w:val="22"/>
+          <w:szCs w:val="22"/>
+        </w:rPr>
+        <w:t xml:space="preserve"> which will return the category and lastly we will pass all 3 </w:t>
+      </w:r>
+      <w:proofErr w:type="spellStart"/>
+      <w:r>
+        <w:rPr>
+          <w:sz w:val="22"/>
+          <w:szCs w:val="22"/>
+        </w:rPr>
+        <w:t>ExcelRow</w:t>
+      </w:r>
+      <w:proofErr w:type="spellEnd"/>
+      <w:r>
+        <w:rPr>
+          <w:sz w:val="22"/>
+          <w:szCs w:val="22"/>
+        </w:rPr>
+        <w:t xml:space="preserve">, merchant name &amp; category to Transaction </w:t>
+      </w:r>
+      <w:proofErr w:type="spellStart"/>
+      <w:r>
+        <w:rPr>
+          <w:sz w:val="22"/>
+          <w:szCs w:val="22"/>
+        </w:rPr>
+        <w:t>mapper</w:t>
+      </w:r>
+      <w:proofErr w:type="spellEnd"/>
+      <w:r>
+        <w:rPr>
+          <w:sz w:val="22"/>
+          <w:szCs w:val="22"/>
+        </w:rPr>
+        <w:t xml:space="preserve"> which will do the work of mapping and returning back a transaction. Finally we will add that single transaction to list.</w:t>
+      </w:r>
+    </w:p>
+    <w:p>
+      <w:pPr>
+        <w:pStyle w:val="ListParagraph"/>
+        <w:numPr>
+          <w:ilvl w:val="0"/>
+          <w:numId w:val="7"/>
+        </w:numPr>
+        <w:rPr>
+          <w:sz w:val="22"/>
+          <w:szCs w:val="22"/>
+        </w:rPr>
+      </w:pPr>
+      <w:r>
+        <w:rPr>
+          <w:sz w:val="22"/>
+          <w:szCs w:val="22"/>
+        </w:rPr>
+        <w:t xml:space="preserve">So the flow is like this – user uploads the file to controller -&gt; transaction service -&gt; </w:t>
+      </w:r>
+      <w:proofErr w:type="spellStart"/>
+      <w:r>
+        <w:rPr>
+          <w:sz w:val="22"/>
+          <w:szCs w:val="22"/>
+        </w:rPr>
+        <w:t>excelParserService</w:t>
+      </w:r>
+      <w:proofErr w:type="spellEnd"/>
+      <w:r>
+        <w:rPr>
+          <w:sz w:val="22"/>
+          <w:szCs w:val="22"/>
+        </w:rPr>
+        <w:t xml:space="preserve"> -&gt; gives List&lt;</w:t>
+      </w:r>
+      <w:proofErr w:type="spellStart"/>
+      <w:r>
+        <w:rPr>
+          <w:sz w:val="22"/>
+          <w:szCs w:val="22"/>
+        </w:rPr>
+        <w:t>ExcelRow</w:t>
+      </w:r>
+      <w:proofErr w:type="spellEnd"/>
+      <w:r>
+        <w:rPr>
+          <w:sz w:val="22"/>
+          <w:szCs w:val="22"/>
+        </w:rPr>
+        <w:t xml:space="preserve">&gt; -&gt; loop through it -&gt; extract </w:t>
+      </w:r>
+      <w:proofErr w:type="spellStart"/>
+      <w:r>
+        <w:rPr>
+          <w:sz w:val="22"/>
+          <w:szCs w:val="22"/>
+        </w:rPr>
+        <w:t>merchantName</w:t>
+      </w:r>
+      <w:proofErr w:type="spellEnd"/>
+      <w:r>
+        <w:rPr>
+          <w:sz w:val="22"/>
+          <w:szCs w:val="22"/>
+        </w:rPr>
+        <w:t xml:space="preserve"> using </w:t>
+      </w:r>
+      <w:proofErr w:type="spellStart"/>
+      <w:r>
+        <w:rPr>
+          <w:sz w:val="22"/>
+          <w:szCs w:val="22"/>
+        </w:rPr>
+        <w:t>merchantExtractor</w:t>
+      </w:r>
+      <w:proofErr w:type="spellEnd"/>
+      <w:r>
+        <w:rPr>
+          <w:sz w:val="22"/>
+          <w:szCs w:val="22"/>
+        </w:rPr>
+        <w:t xml:space="preserve"> -&gt; extract </w:t>
+      </w:r>
+      <w:proofErr w:type="spellStart"/>
+      <w:r>
+        <w:rPr>
+          <w:sz w:val="22"/>
+          <w:szCs w:val="22"/>
+        </w:rPr>
+        <w:t>merchantCategory</w:t>
+      </w:r>
+      <w:proofErr w:type="spellEnd"/>
+      <w:r>
+        <w:rPr>
+          <w:sz w:val="22"/>
+          <w:szCs w:val="22"/>
+        </w:rPr>
+        <w:t xml:space="preserve"> based on </w:t>
+      </w:r>
+      <w:proofErr w:type="spellStart"/>
+      <w:r>
+        <w:rPr>
+          <w:sz w:val="22"/>
+          <w:szCs w:val="22"/>
+        </w:rPr>
+        <w:t>merchantName</w:t>
+      </w:r>
+      <w:proofErr w:type="spellEnd"/>
+      <w:r>
+        <w:rPr>
+          <w:sz w:val="22"/>
+          <w:szCs w:val="22"/>
+        </w:rPr>
+        <w:t xml:space="preserve"> -&gt; pass to </w:t>
+      </w:r>
+      <w:proofErr w:type="spellStart"/>
+      <w:r>
+        <w:rPr>
+          <w:sz w:val="22"/>
+          <w:szCs w:val="22"/>
+        </w:rPr>
+        <w:t>TransactionMapper</w:t>
+      </w:r>
+      <w:proofErr w:type="spellEnd"/>
+      <w:r>
+        <w:rPr>
+          <w:sz w:val="22"/>
+          <w:szCs w:val="22"/>
+        </w:rPr>
+        <w:t xml:space="preserve"> with 3 things -&gt; get a mapped transaction back -&gt; add it to the list.</w:t>
+      </w:r>
     </w:p>
     <w:sectPr>
       <w:pgSz w:w="11906" w:h="16838"/>
@@ -3695,6 +4090,119 @@
     </w:lvl>
   </w:abstractNum>
   <w:abstractNum w:abstractNumId="3">
+    <w:nsid w:val="35B636DE"/>
+    <w:multiLevelType w:val="hybridMultilevel"/>
+    <w:tmpl w:val="5A922CB2"/>
+    <w:lvl w:ilvl="0" w:tplc="04090001">
+      <w:start w:val="1"/>
+      <w:numFmt w:val="bullet"/>
+      <w:lvlText w:val=""/>
+      <w:lvlJc w:val="left"/>
+      <w:pPr>
+        <w:ind w:left="720" w:hanging="360"/>
+      </w:pPr>
+      <w:rPr>
+        <w:rFonts w:ascii="Symbol" w:hAnsi="Symbol" w:hint="default"/>
+      </w:rPr>
+    </w:lvl>
+    <w:lvl w:ilvl="1" w:tplc="04090003" w:tentative="1">
+      <w:start w:val="1"/>
+      <w:numFmt w:val="bullet"/>
+      <w:lvlText w:val="o"/>
+      <w:lvlJc w:val="left"/>
+      <w:pPr>
+        <w:ind w:left="1440" w:hanging="360"/>
+      </w:pPr>
+      <w:rPr>
+        <w:rFonts w:ascii="Courier New" w:hAnsi="Courier New" w:cs="Courier New" w:hint="default"/>
+      </w:rPr>
+    </w:lvl>
+    <w:lvl w:ilvl="2" w:tplc="04090005" w:tentative="1">
+      <w:start w:val="1"/>
+      <w:numFmt w:val="bullet"/>
+      <w:lvlText w:val=""/>
+      <w:lvlJc w:val="left"/>
+      <w:pPr>
+        <w:ind w:left="2160" w:hanging="360"/>
+      </w:pPr>
+      <w:rPr>
+        <w:rFonts w:ascii="Wingdings" w:hAnsi="Wingdings" w:hint="default"/>
+      </w:rPr>
+    </w:lvl>
+    <w:lvl w:ilvl="3" w:tplc="04090001" w:tentative="1">
+      <w:start w:val="1"/>
+      <w:numFmt w:val="bullet"/>
+      <w:lvlText w:val=""/>
+      <w:lvlJc w:val="left"/>
+      <w:pPr>
+        <w:ind w:left="2880" w:hanging="360"/>
+      </w:pPr>
+      <w:rPr>
+        <w:rFonts w:ascii="Symbol" w:hAnsi="Symbol" w:hint="default"/>
+      </w:rPr>
+    </w:lvl>
+    <w:lvl w:ilvl="4" w:tplc="04090003" w:tentative="1">
+      <w:start w:val="1"/>
+      <w:numFmt w:val="bullet"/>
+      <w:lvlText w:val="o"/>
+      <w:lvlJc w:val="left"/>
+      <w:pPr>
+        <w:ind w:left="3600" w:hanging="360"/>
+      </w:pPr>
+      <w:rPr>
+        <w:rFonts w:ascii="Courier New" w:hAnsi="Courier New" w:cs="Courier New" w:hint="default"/>
+      </w:rPr>
+    </w:lvl>
+    <w:lvl w:ilvl="5" w:tplc="04090005" w:tentative="1">
+      <w:start w:val="1"/>
+      <w:numFmt w:val="bullet"/>
+      <w:lvlText w:val=""/>
+      <w:lvlJc w:val="left"/>
+      <w:pPr>
+        <w:ind w:left="4320" w:hanging="360"/>
+      </w:pPr>
+      <w:rPr>
+        <w:rFonts w:ascii="Wingdings" w:hAnsi="Wingdings" w:hint="default"/>
+      </w:rPr>
+    </w:lvl>
+    <w:lvl w:ilvl="6" w:tplc="04090001" w:tentative="1">
+      <w:start w:val="1"/>
+      <w:numFmt w:val="bullet"/>
+      <w:lvlText w:val=""/>
+      <w:lvlJc w:val="left"/>
+      <w:pPr>
+        <w:ind w:left="5040" w:hanging="360"/>
+      </w:pPr>
+      <w:rPr>
+        <w:rFonts w:ascii="Symbol" w:hAnsi="Symbol" w:hint="default"/>
+      </w:rPr>
+    </w:lvl>
+    <w:lvl w:ilvl="7" w:tplc="04090003" w:tentative="1">
+      <w:start w:val="1"/>
+      <w:numFmt w:val="bullet"/>
+      <w:lvlText w:val="o"/>
+      <w:lvlJc w:val="left"/>
+      <w:pPr>
+        <w:ind w:left="5760" w:hanging="360"/>
+      </w:pPr>
+      <w:rPr>
+        <w:rFonts w:ascii="Courier New" w:hAnsi="Courier New" w:cs="Courier New" w:hint="default"/>
+      </w:rPr>
+    </w:lvl>
+    <w:lvl w:ilvl="8" w:tplc="04090005" w:tentative="1">
+      <w:start w:val="1"/>
+      <w:numFmt w:val="bullet"/>
+      <w:lvlText w:val=""/>
+      <w:lvlJc w:val="left"/>
+      <w:pPr>
+        <w:ind w:left="6480" w:hanging="360"/>
+      </w:pPr>
+      <w:rPr>
+        <w:rFonts w:ascii="Wingdings" w:hAnsi="Wingdings" w:hint="default"/>
+      </w:rPr>
+    </w:lvl>
+  </w:abstractNum>
+  <w:abstractNum w:abstractNumId="4">
     <w:nsid w:val="68C47F62"/>
     <w:multiLevelType w:val="hybridMultilevel"/>
     <w:tmpl w:val="6F3E081E"/>
@@ -3807,7 +4315,7 @@
       </w:rPr>
     </w:lvl>
   </w:abstractNum>
-  <w:abstractNum w:abstractNumId="4">
+  <w:abstractNum w:abstractNumId="5">
     <w:nsid w:val="71CB4786"/>
     <w:multiLevelType w:val="hybridMultilevel"/>
     <w:tmpl w:val="3050D5BC"/>
@@ -3920,7 +4428,7 @@
       </w:rPr>
     </w:lvl>
   </w:abstractNum>
-  <w:abstractNum w:abstractNumId="5">
+  <w:abstractNum w:abstractNumId="6">
     <w:nsid w:val="7D5C737A"/>
     <w:multiLevelType w:val="hybridMultilevel"/>
     <w:tmpl w:val="DE42117C"/>
@@ -4034,10 +4542,10 @@
     </w:lvl>
   </w:abstractNum>
   <w:num w:numId="1">
-    <w:abstractNumId w:val="3"/>
+    <w:abstractNumId w:val="4"/>
   </w:num>
   <w:num w:numId="2">
-    <w:abstractNumId w:val="5"/>
+    <w:abstractNumId w:val="6"/>
   </w:num>
   <w:num w:numId="3">
     <w:abstractNumId w:val="1"/>
@@ -4046,10 +4554,13 @@
     <w:abstractNumId w:val="0"/>
   </w:num>
   <w:num w:numId="5">
-    <w:abstractNumId w:val="4"/>
+    <w:abstractNumId w:val="5"/>
   </w:num>
   <w:num w:numId="6">
     <w:abstractNumId w:val="2"/>
+  </w:num>
+  <w:num w:numId="7">
+    <w:abstractNumId w:val="3"/>
   </w:num>
 </w:numbering>
 </file>
@@ -4599,7 +5110,7 @@
   <a:extraClrSchemeLst/>
   <a:extLst>
     <a:ext uri="{05A4C25C-085E-4340-85A3-A5531E510DB2}">
-      <thm15:themeFamily xmlns="" xmlns:thm15="http://schemas.microsoft.com/office/thememl/2012/main" name="Office Theme" id="{2E142A2C-CD16-42D6-873A-C26D2A0506FA}" vid="{1BDDFF52-6CD6-40A5-AB3C-68EB2F1E4D0A}"/>
+      <thm15:themeFamily xmlns:thm15="http://schemas.microsoft.com/office/thememl/2012/main" xmlns="" name="Office Theme" id="{2E142A2C-CD16-42D6-873A-C26D2A0506FA}" vid="{1BDDFF52-6CD6-40A5-AB3C-68EB2F1E4D0A}"/>
     </a:ext>
   </a:extLst>
 </a:theme>

</xml_diff>

<commit_message>
Saved the txn list to DB
</commit_message>
<xml_diff>
--- a/Revision Notes.docx
+++ b/Revision Notes.docx
@@ -3134,223 +3134,18 @@
           <w:sz w:val="22"/>
           <w:szCs w:val="22"/>
         </w:rPr>
-        <w:t xml:space="preserve"> in the table with @Enumerated(</w:t>
-      </w:r>
-      <w:proofErr w:type="spellStart"/>
-      <w:r>
-        <w:rPr>
-          <w:sz w:val="22"/>
-          <w:szCs w:val="22"/>
-        </w:rPr>
-        <w:t>EnumType.STRING</w:t>
-      </w:r>
-      <w:proofErr w:type="spellEnd"/>
-      <w:r>
-        <w:rPr>
-          <w:sz w:val="22"/>
-          <w:szCs w:val="22"/>
-        </w:rPr>
-        <w:t xml:space="preserve">) annotation – it tells JPA to map this </w:t>
-      </w:r>
-      <w:proofErr w:type="spellStart"/>
-      <w:r>
-        <w:rPr>
-          <w:sz w:val="22"/>
-          <w:szCs w:val="22"/>
-        </w:rPr>
-        <w:t>enum</w:t>
-      </w:r>
-      <w:proofErr w:type="spellEnd"/>
-      <w:r>
-        <w:rPr>
-          <w:sz w:val="22"/>
-          <w:szCs w:val="22"/>
-        </w:rPr>
-        <w:t xml:space="preserve"> into table column and </w:t>
-      </w:r>
-      <w:proofErr w:type="spellStart"/>
-      <w:r>
-        <w:rPr>
-          <w:sz w:val="22"/>
-          <w:szCs w:val="22"/>
-        </w:rPr>
-        <w:t>EnumType.STRING</w:t>
-      </w:r>
-      <w:proofErr w:type="spellEnd"/>
-      <w:r>
-        <w:rPr>
-          <w:sz w:val="22"/>
-          <w:szCs w:val="22"/>
-        </w:rPr>
-        <w:t xml:space="preserve"> means store the </w:t>
-      </w:r>
-      <w:proofErr w:type="spellStart"/>
-      <w:r>
-        <w:rPr>
-          <w:sz w:val="22"/>
-          <w:szCs w:val="22"/>
-        </w:rPr>
-        <w:t>enum</w:t>
-      </w:r>
-      <w:proofErr w:type="spellEnd"/>
-      <w:r>
-        <w:rPr>
-          <w:sz w:val="22"/>
-          <w:szCs w:val="22"/>
-        </w:rPr>
-        <w:t xml:space="preserve"> names as it is. And there’s one more the </w:t>
-      </w:r>
-      <w:proofErr w:type="spellStart"/>
-      <w:r>
-        <w:rPr>
-          <w:sz w:val="22"/>
-          <w:szCs w:val="22"/>
-        </w:rPr>
-        <w:t>EnumType.ORDINAL</w:t>
-      </w:r>
-      <w:proofErr w:type="spellEnd"/>
-      <w:r>
-        <w:rPr>
-          <w:sz w:val="22"/>
-          <w:szCs w:val="22"/>
-        </w:rPr>
-        <w:t xml:space="preserve"> which mean don’t store the name but store it’s index</w:t>
-      </w:r>
-    </w:p>
-    <w:p>
-      <w:pPr>
-        <w:pStyle w:val="ListParagraph"/>
-        <w:numPr>
-          <w:ilvl w:val="0"/>
-          <w:numId w:val="6"/>
-        </w:numPr>
-        <w:rPr>
-          <w:sz w:val="22"/>
-          <w:szCs w:val="22"/>
-        </w:rPr>
-      </w:pPr>
-      <w:r>
-        <w:rPr>
-          <w:sz w:val="22"/>
-          <w:szCs w:val="22"/>
-        </w:rPr>
-        <w:t xml:space="preserve">Created a map in </w:t>
-      </w:r>
-      <w:proofErr w:type="spellStart"/>
-      <w:r>
-        <w:rPr>
-          <w:sz w:val="22"/>
-          <w:szCs w:val="22"/>
-        </w:rPr>
-        <w:t>MerchantCategorizer</w:t>
-      </w:r>
-      <w:proofErr w:type="spellEnd"/>
-      <w:r>
-        <w:rPr>
-          <w:sz w:val="22"/>
-          <w:szCs w:val="22"/>
-        </w:rPr>
-        <w:t xml:space="preserve"> and hardcoded many merchant names along with their category type</w:t>
-      </w:r>
-    </w:p>
-    <w:p>
-      <w:pPr>
-        <w:pStyle w:val="ListParagraph"/>
-        <w:numPr>
-          <w:ilvl w:val="0"/>
-          <w:numId w:val="6"/>
-        </w:numPr>
-        <w:rPr>
-          <w:sz w:val="22"/>
-          <w:szCs w:val="22"/>
-        </w:rPr>
-      </w:pPr>
-      <w:r>
-        <w:rPr>
-          <w:sz w:val="22"/>
-          <w:szCs w:val="22"/>
-        </w:rPr>
-        <w:t xml:space="preserve">Created method </w:t>
-      </w:r>
-      <w:proofErr w:type="spellStart"/>
-      <w:proofErr w:type="gramStart"/>
-      <w:r>
-        <w:rPr>
-          <w:sz w:val="22"/>
-          <w:szCs w:val="22"/>
-        </w:rPr>
-        <w:t>determineCategory</w:t>
-      </w:r>
-      <w:proofErr w:type="spellEnd"/>
-      <w:r>
-        <w:rPr>
-          <w:sz w:val="22"/>
-          <w:szCs w:val="22"/>
-        </w:rPr>
-        <w:t>(</w:t>
-      </w:r>
-      <w:proofErr w:type="gramEnd"/>
-      <w:r>
-        <w:rPr>
-          <w:sz w:val="22"/>
-          <w:szCs w:val="22"/>
-        </w:rPr>
-        <w:t>) to find the category of merchant.</w:t>
-      </w:r>
-    </w:p>
-    <w:p>
-      <w:pPr>
-        <w:pStyle w:val="ListParagraph"/>
-        <w:numPr>
-          <w:ilvl w:val="0"/>
-          <w:numId w:val="6"/>
-        </w:numPr>
-        <w:rPr>
-          <w:sz w:val="22"/>
-          <w:szCs w:val="22"/>
-        </w:rPr>
-      </w:pPr>
-      <w:r>
-        <w:rPr>
-          <w:sz w:val="22"/>
-          <w:szCs w:val="22"/>
-        </w:rPr>
-        <w:t xml:space="preserve">Did mapping for merchant name and transaction category in transaction </w:t>
-      </w:r>
-      <w:proofErr w:type="spellStart"/>
-      <w:r>
-        <w:rPr>
-          <w:sz w:val="22"/>
-          <w:szCs w:val="22"/>
-        </w:rPr>
-        <w:t>Mapper</w:t>
-      </w:r>
-      <w:proofErr w:type="spellEnd"/>
-      <w:r>
-        <w:rPr>
-          <w:sz w:val="22"/>
-          <w:szCs w:val="22"/>
-        </w:rPr>
-        <w:t xml:space="preserve"> class.</w:t>
-      </w:r>
-    </w:p>
-    <w:p>
-      <w:pPr>
-        <w:rPr>
-          <w:sz w:val="22"/>
-          <w:szCs w:val="22"/>
-        </w:rPr>
-      </w:pPr>
-    </w:p>
-    <w:p>
-      <w:pPr>
+        <w:t xml:space="preserve"> in the table with </w:t>
+      </w:r>
+      <w:r>
         <w:rPr>
           <w:b/>
           <w:bCs/>
           <w:sz w:val="22"/>
           <w:szCs w:val="22"/>
         </w:rPr>
-      </w:pPr>
+        <w:t>@Enumerated(</w:t>
+      </w:r>
+      <w:proofErr w:type="spellStart"/>
       <w:r>
         <w:rPr>
           <w:b/>
@@ -3358,6 +3153,231 @@
           <w:sz w:val="22"/>
           <w:szCs w:val="22"/>
         </w:rPr>
+        <w:t>EnumType.STRING</w:t>
+      </w:r>
+      <w:proofErr w:type="spellEnd"/>
+      <w:r>
+        <w:rPr>
+          <w:b/>
+          <w:bCs/>
+          <w:sz w:val="22"/>
+          <w:szCs w:val="22"/>
+        </w:rPr>
+        <w:t>)</w:t>
+      </w:r>
+      <w:r>
+        <w:rPr>
+          <w:sz w:val="22"/>
+          <w:szCs w:val="22"/>
+        </w:rPr>
+        <w:t xml:space="preserve"> annotation – it tells JPA to map this </w:t>
+      </w:r>
+      <w:proofErr w:type="spellStart"/>
+      <w:r>
+        <w:rPr>
+          <w:sz w:val="22"/>
+          <w:szCs w:val="22"/>
+        </w:rPr>
+        <w:t>enum</w:t>
+      </w:r>
+      <w:proofErr w:type="spellEnd"/>
+      <w:r>
+        <w:rPr>
+          <w:sz w:val="22"/>
+          <w:szCs w:val="22"/>
+        </w:rPr>
+        <w:t xml:space="preserve"> into table column and </w:t>
+      </w:r>
+      <w:proofErr w:type="spellStart"/>
+      <w:r>
+        <w:rPr>
+          <w:sz w:val="22"/>
+          <w:szCs w:val="22"/>
+        </w:rPr>
+        <w:t>EnumType.STRING</w:t>
+      </w:r>
+      <w:proofErr w:type="spellEnd"/>
+      <w:r>
+        <w:rPr>
+          <w:sz w:val="22"/>
+          <w:szCs w:val="22"/>
+        </w:rPr>
+        <w:t xml:space="preserve"> means store the </w:t>
+      </w:r>
+      <w:proofErr w:type="spellStart"/>
+      <w:r>
+        <w:rPr>
+          <w:sz w:val="22"/>
+          <w:szCs w:val="22"/>
+        </w:rPr>
+        <w:t>enum</w:t>
+      </w:r>
+      <w:proofErr w:type="spellEnd"/>
+      <w:r>
+        <w:rPr>
+          <w:sz w:val="22"/>
+          <w:szCs w:val="22"/>
+        </w:rPr>
+        <w:t xml:space="preserve"> names as it is. And there’s one more the </w:t>
+      </w:r>
+      <w:proofErr w:type="spellStart"/>
+      <w:r>
+        <w:rPr>
+          <w:sz w:val="22"/>
+          <w:szCs w:val="22"/>
+        </w:rPr>
+        <w:t>EnumType.ORDINAL</w:t>
+      </w:r>
+      <w:proofErr w:type="spellEnd"/>
+      <w:r>
+        <w:rPr>
+          <w:sz w:val="22"/>
+          <w:szCs w:val="22"/>
+        </w:rPr>
+        <w:t xml:space="preserve"> which mean don’t store the name but store it’s index</w:t>
+      </w:r>
+    </w:p>
+    <w:p>
+      <w:pPr>
+        <w:pStyle w:val="ListParagraph"/>
+        <w:numPr>
+          <w:ilvl w:val="0"/>
+          <w:numId w:val="6"/>
+        </w:numPr>
+        <w:rPr>
+          <w:sz w:val="22"/>
+          <w:szCs w:val="22"/>
+        </w:rPr>
+      </w:pPr>
+      <w:r>
+        <w:rPr>
+          <w:sz w:val="22"/>
+          <w:szCs w:val="22"/>
+        </w:rPr>
+        <w:t xml:space="preserve">Created a map in </w:t>
+      </w:r>
+      <w:proofErr w:type="spellStart"/>
+      <w:r>
+        <w:rPr>
+          <w:sz w:val="22"/>
+          <w:szCs w:val="22"/>
+        </w:rPr>
+        <w:t>MerchantCategorizer</w:t>
+      </w:r>
+      <w:proofErr w:type="spellEnd"/>
+      <w:r>
+        <w:rPr>
+          <w:sz w:val="22"/>
+          <w:szCs w:val="22"/>
+        </w:rPr>
+        <w:t xml:space="preserve"> and hardcoded many merchant names along with their category type</w:t>
+      </w:r>
+    </w:p>
+    <w:p>
+      <w:pPr>
+        <w:pStyle w:val="ListParagraph"/>
+        <w:numPr>
+          <w:ilvl w:val="0"/>
+          <w:numId w:val="6"/>
+        </w:numPr>
+        <w:rPr>
+          <w:sz w:val="22"/>
+          <w:szCs w:val="22"/>
+        </w:rPr>
+      </w:pPr>
+      <w:r>
+        <w:rPr>
+          <w:sz w:val="22"/>
+          <w:szCs w:val="22"/>
+        </w:rPr>
+        <w:t xml:space="preserve">Created method </w:t>
+      </w:r>
+      <w:proofErr w:type="spellStart"/>
+      <w:proofErr w:type="gramStart"/>
+      <w:r>
+        <w:rPr>
+          <w:sz w:val="22"/>
+          <w:szCs w:val="22"/>
+        </w:rPr>
+        <w:t>determineCategory</w:t>
+      </w:r>
+      <w:proofErr w:type="spellEnd"/>
+      <w:r>
+        <w:rPr>
+          <w:sz w:val="22"/>
+          <w:szCs w:val="22"/>
+        </w:rPr>
+        <w:t>(</w:t>
+      </w:r>
+      <w:proofErr w:type="gramEnd"/>
+      <w:r>
+        <w:rPr>
+          <w:sz w:val="22"/>
+          <w:szCs w:val="22"/>
+        </w:rPr>
+        <w:t>) to find the category of merchant.</w:t>
+      </w:r>
+    </w:p>
+    <w:p>
+      <w:pPr>
+        <w:pStyle w:val="ListParagraph"/>
+        <w:numPr>
+          <w:ilvl w:val="0"/>
+          <w:numId w:val="6"/>
+        </w:numPr>
+        <w:rPr>
+          <w:sz w:val="22"/>
+          <w:szCs w:val="22"/>
+        </w:rPr>
+      </w:pPr>
+      <w:r>
+        <w:rPr>
+          <w:sz w:val="22"/>
+          <w:szCs w:val="22"/>
+        </w:rPr>
+        <w:t xml:space="preserve">Did mapping for merchant name and transaction category in transaction </w:t>
+      </w:r>
+      <w:proofErr w:type="spellStart"/>
+      <w:r>
+        <w:rPr>
+          <w:sz w:val="22"/>
+          <w:szCs w:val="22"/>
+        </w:rPr>
+        <w:t>Mapper</w:t>
+      </w:r>
+      <w:proofErr w:type="spellEnd"/>
+      <w:r>
+        <w:rPr>
+          <w:sz w:val="22"/>
+          <w:szCs w:val="22"/>
+        </w:rPr>
+        <w:t xml:space="preserve"> class.</w:t>
+      </w:r>
+    </w:p>
+    <w:p>
+      <w:pPr>
+        <w:rPr>
+          <w:sz w:val="22"/>
+          <w:szCs w:val="22"/>
+        </w:rPr>
+      </w:pPr>
+    </w:p>
+    <w:p>
+      <w:pPr>
+        <w:rPr>
+          <w:b/>
+          <w:bCs/>
+          <w:sz w:val="22"/>
+          <w:szCs w:val="22"/>
+        </w:rPr>
+      </w:pPr>
+      <w:r>
+        <w:rPr>
+          <w:b/>
+          <w:bCs/>
+          <w:sz w:val="22"/>
+          <w:szCs w:val="22"/>
+        </w:rPr>
         <w:t>Stuff did on 10/07/2026:</w:t>
       </w:r>
     </w:p>
@@ -3737,6 +3757,323 @@
         </w:rPr>
         <w:t xml:space="preserve"> with 3 things -&gt; get a mapped transaction back -&gt; add it to the list.</w:t>
       </w:r>
+    </w:p>
+    <w:p>
+      <w:pPr>
+        <w:rPr>
+          <w:sz w:val="22"/>
+          <w:szCs w:val="22"/>
+        </w:rPr>
+      </w:pPr>
+    </w:p>
+    <w:p>
+      <w:pPr>
+        <w:rPr>
+          <w:b/>
+          <w:bCs/>
+          <w:sz w:val="22"/>
+          <w:szCs w:val="22"/>
+        </w:rPr>
+      </w:pPr>
+    </w:p>
+    <w:p>
+      <w:pPr>
+        <w:rPr>
+          <w:b/>
+          <w:bCs/>
+          <w:sz w:val="22"/>
+          <w:szCs w:val="22"/>
+        </w:rPr>
+      </w:pPr>
+      <w:r>
+        <w:rPr>
+          <w:b/>
+          <w:bCs/>
+          <w:sz w:val="22"/>
+          <w:szCs w:val="22"/>
+        </w:rPr>
+        <w:lastRenderedPageBreak/>
+        <w:t>Stuff did on 14/07/2026:</w:t>
+      </w:r>
+    </w:p>
+    <w:p>
+      <w:pPr>
+        <w:pStyle w:val="ListParagraph"/>
+        <w:numPr>
+          <w:ilvl w:val="0"/>
+          <w:numId w:val="8"/>
+        </w:numPr>
+        <w:rPr>
+          <w:sz w:val="22"/>
+          <w:szCs w:val="22"/>
+        </w:rPr>
+      </w:pPr>
+      <w:r>
+        <w:rPr>
+          <w:sz w:val="22"/>
+          <w:szCs w:val="22"/>
+        </w:rPr>
+        <w:t xml:space="preserve">Implemented the remaining part of our parsing and save </w:t>
+      </w:r>
+      <w:proofErr w:type="spellStart"/>
+      <w:r>
+        <w:rPr>
+          <w:sz w:val="22"/>
+          <w:szCs w:val="22"/>
+        </w:rPr>
+        <w:t>txn</w:t>
+      </w:r>
+      <w:proofErr w:type="spellEnd"/>
+      <w:r>
+        <w:rPr>
+          <w:sz w:val="22"/>
+          <w:szCs w:val="22"/>
+        </w:rPr>
+        <w:t xml:space="preserve"> in db part. Where earlier we used to get user as null when we printed the </w:t>
+      </w:r>
+      <w:proofErr w:type="spellStart"/>
+      <w:r>
+        <w:rPr>
+          <w:sz w:val="22"/>
+          <w:szCs w:val="22"/>
+        </w:rPr>
+        <w:t>txn</w:t>
+      </w:r>
+      <w:proofErr w:type="spellEnd"/>
+      <w:r>
+        <w:rPr>
+          <w:sz w:val="22"/>
+          <w:szCs w:val="22"/>
+        </w:rPr>
+        <w:t xml:space="preserve"> record.</w:t>
+      </w:r>
+    </w:p>
+    <w:p>
+      <w:pPr>
+        <w:pStyle w:val="ListParagraph"/>
+        <w:numPr>
+          <w:ilvl w:val="0"/>
+          <w:numId w:val="8"/>
+        </w:numPr>
+        <w:rPr>
+          <w:sz w:val="22"/>
+          <w:szCs w:val="22"/>
+        </w:rPr>
+      </w:pPr>
+      <w:r>
+        <w:rPr>
+          <w:sz w:val="22"/>
+          <w:szCs w:val="22"/>
+        </w:rPr>
+        <w:t xml:space="preserve">Now we get user mapped to it. Implemented to retrieve username and then get the user from db and then map it to each </w:t>
+      </w:r>
+      <w:proofErr w:type="spellStart"/>
+      <w:r>
+        <w:rPr>
+          <w:sz w:val="22"/>
+          <w:szCs w:val="22"/>
+        </w:rPr>
+        <w:t>txn</w:t>
+      </w:r>
+      <w:proofErr w:type="spellEnd"/>
+      <w:r>
+        <w:rPr>
+          <w:sz w:val="22"/>
+          <w:szCs w:val="22"/>
+        </w:rPr>
+        <w:t>.</w:t>
+      </w:r>
+    </w:p>
+    <w:p>
+      <w:pPr>
+        <w:pStyle w:val="ListParagraph"/>
+        <w:numPr>
+          <w:ilvl w:val="0"/>
+          <w:numId w:val="8"/>
+        </w:numPr>
+        <w:rPr>
+          <w:sz w:val="22"/>
+          <w:szCs w:val="22"/>
+        </w:rPr>
+      </w:pPr>
+      <w:proofErr w:type="spellStart"/>
+      <w:r>
+        <w:rPr>
+          <w:sz w:val="22"/>
+          <w:szCs w:val="22"/>
+        </w:rPr>
+        <w:t>JPARepository</w:t>
+      </w:r>
+      <w:proofErr w:type="spellEnd"/>
+      <w:r>
+        <w:rPr>
+          <w:sz w:val="22"/>
+          <w:szCs w:val="22"/>
+        </w:rPr>
+        <w:t xml:space="preserve"> interface implements </w:t>
+      </w:r>
+      <w:proofErr w:type="spellStart"/>
+      <w:r>
+        <w:rPr>
+          <w:sz w:val="22"/>
+          <w:szCs w:val="22"/>
+        </w:rPr>
+        <w:t>ListPagingAndSortingRepository</w:t>
+      </w:r>
+      <w:proofErr w:type="spellEnd"/>
+      <w:r>
+        <w:rPr>
+          <w:sz w:val="22"/>
+          <w:szCs w:val="22"/>
+        </w:rPr>
+        <w:t xml:space="preserve"> which in turn implements </w:t>
+      </w:r>
+      <w:proofErr w:type="spellStart"/>
+      <w:r>
+        <w:rPr>
+          <w:sz w:val="22"/>
+          <w:szCs w:val="22"/>
+        </w:rPr>
+        <w:t>CrudRepository</w:t>
+      </w:r>
+      <w:proofErr w:type="spellEnd"/>
+      <w:r>
+        <w:rPr>
+          <w:sz w:val="22"/>
+          <w:szCs w:val="22"/>
+        </w:rPr>
+        <w:t xml:space="preserve">. </w:t>
+      </w:r>
+    </w:p>
+    <w:p>
+      <w:pPr>
+        <w:pStyle w:val="ListParagraph"/>
+        <w:numPr>
+          <w:ilvl w:val="0"/>
+          <w:numId w:val="8"/>
+        </w:numPr>
+        <w:rPr>
+          <w:sz w:val="22"/>
+          <w:szCs w:val="22"/>
+        </w:rPr>
+      </w:pPr>
+      <w:proofErr w:type="spellStart"/>
+      <w:r>
+        <w:rPr>
+          <w:sz w:val="22"/>
+          <w:szCs w:val="22"/>
+        </w:rPr>
+        <w:t>JPARepository</w:t>
+      </w:r>
+      <w:proofErr w:type="spellEnd"/>
+      <w:r>
+        <w:rPr>
+          <w:sz w:val="22"/>
+          <w:szCs w:val="22"/>
+        </w:rPr>
+        <w:t xml:space="preserve"> generally takes 2 </w:t>
+      </w:r>
+      <w:proofErr w:type="spellStart"/>
+      <w:r>
+        <w:rPr>
+          <w:sz w:val="22"/>
+          <w:szCs w:val="22"/>
+        </w:rPr>
+        <w:t>params</w:t>
+      </w:r>
+      <w:proofErr w:type="spellEnd"/>
+      <w:r>
+        <w:rPr>
+          <w:sz w:val="22"/>
+          <w:szCs w:val="22"/>
+        </w:rPr>
+        <w:t xml:space="preserve"> – first is the Entity data type on which it will work i.e. Transaction which we created today and second is the primary id data type which is </w:t>
+      </w:r>
+      <w:proofErr w:type="gramStart"/>
+      <w:r>
+        <w:rPr>
+          <w:sz w:val="22"/>
+          <w:szCs w:val="22"/>
+        </w:rPr>
+        <w:t>Long</w:t>
+      </w:r>
+      <w:proofErr w:type="gramEnd"/>
+      <w:r>
+        <w:rPr>
+          <w:sz w:val="22"/>
+          <w:szCs w:val="22"/>
+        </w:rPr>
+        <w:t xml:space="preserve"> for id attribute.</w:t>
+      </w:r>
+    </w:p>
+    <w:p>
+      <w:pPr>
+        <w:pStyle w:val="ListParagraph"/>
+        <w:numPr>
+          <w:ilvl w:val="0"/>
+          <w:numId w:val="8"/>
+        </w:numPr>
+        <w:rPr>
+          <w:sz w:val="22"/>
+          <w:szCs w:val="22"/>
+        </w:rPr>
+      </w:pPr>
+      <w:r>
+        <w:rPr>
+          <w:sz w:val="22"/>
+          <w:szCs w:val="22"/>
+        </w:rPr>
+        <w:t xml:space="preserve">Understood that first the id is null for all </w:t>
+      </w:r>
+      <w:proofErr w:type="spellStart"/>
+      <w:r>
+        <w:rPr>
+          <w:sz w:val="22"/>
+          <w:szCs w:val="22"/>
+        </w:rPr>
+        <w:t>txns</w:t>
+      </w:r>
+      <w:proofErr w:type="spellEnd"/>
+      <w:r>
+        <w:rPr>
+          <w:sz w:val="22"/>
+          <w:szCs w:val="22"/>
+        </w:rPr>
+        <w:t xml:space="preserve"> before JPA saves it to db but once it’s saved the same </w:t>
+      </w:r>
+      <w:proofErr w:type="spellStart"/>
+      <w:r>
+        <w:rPr>
+          <w:sz w:val="22"/>
+          <w:szCs w:val="22"/>
+        </w:rPr>
+        <w:t>txns</w:t>
+      </w:r>
+      <w:proofErr w:type="spellEnd"/>
+      <w:r>
+        <w:rPr>
+          <w:sz w:val="22"/>
+          <w:szCs w:val="22"/>
+        </w:rPr>
+        <w:t xml:space="preserve"> objects are updated by JPA thus same list is updated.</w:t>
+      </w:r>
+    </w:p>
+    <w:p>
+      <w:pPr>
+        <w:pStyle w:val="ListParagraph"/>
+        <w:rPr>
+          <w:sz w:val="22"/>
+          <w:szCs w:val="22"/>
+        </w:rPr>
+      </w:pPr>
+    </w:p>
+    <w:p>
+      <w:pPr>
+        <w:rPr>
+          <w:sz w:val="22"/>
+          <w:szCs w:val="22"/>
+        </w:rPr>
+      </w:pPr>
     </w:p>
     <w:sectPr>
       <w:pgSz w:w="11906" w:h="16838"/>
@@ -4203,6 +4540,119 @@
     </w:lvl>
   </w:abstractNum>
   <w:abstractNum w:abstractNumId="4">
+    <w:nsid w:val="4DDF28DC"/>
+    <w:multiLevelType w:val="hybridMultilevel"/>
+    <w:tmpl w:val="855EE44E"/>
+    <w:lvl w:ilvl="0" w:tplc="04090001">
+      <w:start w:val="1"/>
+      <w:numFmt w:val="bullet"/>
+      <w:lvlText w:val=""/>
+      <w:lvlJc w:val="left"/>
+      <w:pPr>
+        <w:ind w:left="720" w:hanging="360"/>
+      </w:pPr>
+      <w:rPr>
+        <w:rFonts w:ascii="Symbol" w:hAnsi="Symbol" w:hint="default"/>
+      </w:rPr>
+    </w:lvl>
+    <w:lvl w:ilvl="1" w:tplc="04090003" w:tentative="1">
+      <w:start w:val="1"/>
+      <w:numFmt w:val="bullet"/>
+      <w:lvlText w:val="o"/>
+      <w:lvlJc w:val="left"/>
+      <w:pPr>
+        <w:ind w:left="1440" w:hanging="360"/>
+      </w:pPr>
+      <w:rPr>
+        <w:rFonts w:ascii="Courier New" w:hAnsi="Courier New" w:cs="Courier New" w:hint="default"/>
+      </w:rPr>
+    </w:lvl>
+    <w:lvl w:ilvl="2" w:tplc="04090005" w:tentative="1">
+      <w:start w:val="1"/>
+      <w:numFmt w:val="bullet"/>
+      <w:lvlText w:val=""/>
+      <w:lvlJc w:val="left"/>
+      <w:pPr>
+        <w:ind w:left="2160" w:hanging="360"/>
+      </w:pPr>
+      <w:rPr>
+        <w:rFonts w:ascii="Wingdings" w:hAnsi="Wingdings" w:hint="default"/>
+      </w:rPr>
+    </w:lvl>
+    <w:lvl w:ilvl="3" w:tplc="04090001" w:tentative="1">
+      <w:start w:val="1"/>
+      <w:numFmt w:val="bullet"/>
+      <w:lvlText w:val=""/>
+      <w:lvlJc w:val="left"/>
+      <w:pPr>
+        <w:ind w:left="2880" w:hanging="360"/>
+      </w:pPr>
+      <w:rPr>
+        <w:rFonts w:ascii="Symbol" w:hAnsi="Symbol" w:hint="default"/>
+      </w:rPr>
+    </w:lvl>
+    <w:lvl w:ilvl="4" w:tplc="04090003" w:tentative="1">
+      <w:start w:val="1"/>
+      <w:numFmt w:val="bullet"/>
+      <w:lvlText w:val="o"/>
+      <w:lvlJc w:val="left"/>
+      <w:pPr>
+        <w:ind w:left="3600" w:hanging="360"/>
+      </w:pPr>
+      <w:rPr>
+        <w:rFonts w:ascii="Courier New" w:hAnsi="Courier New" w:cs="Courier New" w:hint="default"/>
+      </w:rPr>
+    </w:lvl>
+    <w:lvl w:ilvl="5" w:tplc="04090005" w:tentative="1">
+      <w:start w:val="1"/>
+      <w:numFmt w:val="bullet"/>
+      <w:lvlText w:val=""/>
+      <w:lvlJc w:val="left"/>
+      <w:pPr>
+        <w:ind w:left="4320" w:hanging="360"/>
+      </w:pPr>
+      <w:rPr>
+        <w:rFonts w:ascii="Wingdings" w:hAnsi="Wingdings" w:hint="default"/>
+      </w:rPr>
+    </w:lvl>
+    <w:lvl w:ilvl="6" w:tplc="04090001" w:tentative="1">
+      <w:start w:val="1"/>
+      <w:numFmt w:val="bullet"/>
+      <w:lvlText w:val=""/>
+      <w:lvlJc w:val="left"/>
+      <w:pPr>
+        <w:ind w:left="5040" w:hanging="360"/>
+      </w:pPr>
+      <w:rPr>
+        <w:rFonts w:ascii="Symbol" w:hAnsi="Symbol" w:hint="default"/>
+      </w:rPr>
+    </w:lvl>
+    <w:lvl w:ilvl="7" w:tplc="04090003" w:tentative="1">
+      <w:start w:val="1"/>
+      <w:numFmt w:val="bullet"/>
+      <w:lvlText w:val="o"/>
+      <w:lvlJc w:val="left"/>
+      <w:pPr>
+        <w:ind w:left="5760" w:hanging="360"/>
+      </w:pPr>
+      <w:rPr>
+        <w:rFonts w:ascii="Courier New" w:hAnsi="Courier New" w:cs="Courier New" w:hint="default"/>
+      </w:rPr>
+    </w:lvl>
+    <w:lvl w:ilvl="8" w:tplc="04090005" w:tentative="1">
+      <w:start w:val="1"/>
+      <w:numFmt w:val="bullet"/>
+      <w:lvlText w:val=""/>
+      <w:lvlJc w:val="left"/>
+      <w:pPr>
+        <w:ind w:left="6480" w:hanging="360"/>
+      </w:pPr>
+      <w:rPr>
+        <w:rFonts w:ascii="Wingdings" w:hAnsi="Wingdings" w:hint="default"/>
+      </w:rPr>
+    </w:lvl>
+  </w:abstractNum>
+  <w:abstractNum w:abstractNumId="5">
     <w:nsid w:val="68C47F62"/>
     <w:multiLevelType w:val="hybridMultilevel"/>
     <w:tmpl w:val="6F3E081E"/>
@@ -4315,7 +4765,7 @@
       </w:rPr>
     </w:lvl>
   </w:abstractNum>
-  <w:abstractNum w:abstractNumId="5">
+  <w:abstractNum w:abstractNumId="6">
     <w:nsid w:val="71CB4786"/>
     <w:multiLevelType w:val="hybridMultilevel"/>
     <w:tmpl w:val="3050D5BC"/>
@@ -4428,7 +4878,7 @@
       </w:rPr>
     </w:lvl>
   </w:abstractNum>
-  <w:abstractNum w:abstractNumId="6">
+  <w:abstractNum w:abstractNumId="7">
     <w:nsid w:val="7D5C737A"/>
     <w:multiLevelType w:val="hybridMultilevel"/>
     <w:tmpl w:val="DE42117C"/>
@@ -4542,10 +4992,10 @@
     </w:lvl>
   </w:abstractNum>
   <w:num w:numId="1">
-    <w:abstractNumId w:val="4"/>
+    <w:abstractNumId w:val="5"/>
   </w:num>
   <w:num w:numId="2">
-    <w:abstractNumId w:val="6"/>
+    <w:abstractNumId w:val="7"/>
   </w:num>
   <w:num w:numId="3">
     <w:abstractNumId w:val="1"/>
@@ -4554,13 +5004,16 @@
     <w:abstractNumId w:val="0"/>
   </w:num>
   <w:num w:numId="5">
-    <w:abstractNumId w:val="5"/>
+    <w:abstractNumId w:val="6"/>
   </w:num>
   <w:num w:numId="6">
     <w:abstractNumId w:val="2"/>
   </w:num>
   <w:num w:numId="7">
     <w:abstractNumId w:val="3"/>
+  </w:num>
+  <w:num w:numId="8">
+    <w:abstractNumId w:val="4"/>
   </w:num>
 </w:numbering>
 </file>
@@ -5110,7 +5563,7 @@
   <a:extraClrSchemeLst/>
   <a:extLst>
     <a:ext uri="{05A4C25C-085E-4340-85A3-A5531E510DB2}">
-      <thm15:themeFamily xmlns:thm15="http://schemas.microsoft.com/office/thememl/2012/main" xmlns="" name="Office Theme" id="{2E142A2C-CD16-42D6-873A-C26D2A0506FA}" vid="{1BDDFF52-6CD6-40A5-AB3C-68EB2F1E4D0A}"/>
+      <thm15:themeFamily xmlns="" xmlns:thm15="http://schemas.microsoft.com/office/thememl/2012/main" name="Office Theme" id="{2E142A2C-CD16-42D6-873A-C26D2A0506FA}" vid="{1BDDFF52-6CD6-40A5-AB3C-68EB2F1E4D0A}"/>
     </a:ext>
   </a:extLst>
 </a:theme>

</xml_diff>